<commit_message>
Semana 5 al dia con el hallazgo por clase del #121
Ninguno de los tres modelos supera al azar en las DOS clases extremas. El bosque gana
solo en Minimo, el fundacional solo en Minimo, y el avanzado solo en Maximo -- que es
justo la clase donde el mejor modelo falla.

Co-Authored-By: Claude Opus 5 <noreply@anthropic.com>
Claude-Session: https://claude.ai/code/session_01YBrT6YULjQyRaZRYdhHbQc
</commit_message>
<xml_diff>
--- a/docs/entregas/semana-5/Caso 1 - Semana 5 - Informe final.docx
+++ b/docs/entregas/semana-5/Caso 1 - Semana 5 - Informe final.docx
@@ -10527,7 +10527,7 @@
           <w:sz w:val="24"/>
           <w:szCs w:val="24"/>
         </w:rPr>
-        <w:t xml:space="preserve">Todas las cifras son de </w:t>
+        <w:t xml:space="preserve">Las cifras de las secciones 1 a 6 son de </w:t>
       </w:r>
       <w:r>
         <w:rPr>
@@ -10547,7 +10547,7 @@
           <w:sz w:val="24"/>
           <w:szCs w:val="24"/>
         </w:rPr>
-        <w:t xml:space="preserve"> y salen de un archivo de evidencia que se regenera con un comando. La única celda vacía es el bloque de prueba, que se mide </w:t>
+        <w:t xml:space="preserve">; la sección 7 trae lo del bloque de prueba, medido </w:t>
       </w:r>
       <w:r>
         <w:rPr>
@@ -10567,25 +10567,7 @@
           <w:sz w:val="24"/>
           <w:szCs w:val="24"/>
         </w:rPr>
-        <w:t xml:space="preserve"> (D18), el lunes 7 tras el atraso que fija la </w:t>
-      </w:r>
-      <w:r>
-        <w:rPr>
-          <w:rFonts w:ascii="Times New Roman" w:cs="Times New Roman" w:eastAsia="Times New Roman" w:hAnsi="Times New Roman"/>
-          <w:color w:val="000000"/>
-          <w:sz w:val="24"/>
-          <w:szCs w:val="24"/>
-        </w:rPr>
-        <w:t xml:space="preserve">D23</w:t>
-      </w:r>
-      <w:r>
-        <w:rPr>
-          <w:rFonts w:ascii="Times New Roman" w:cs="Times New Roman" w:eastAsia="Times New Roman" w:hAnsi="Times New Roman"/>
-          <w:color w:val="000000"/>
-          <w:sz w:val="24"/>
-          <w:szCs w:val="24"/>
-        </w:rPr>
-        <w:t xml:space="preserve">.</w:t>
+        <w:t xml:space="preserve"> el 07/09 (D18, D23). Todas salen de un archivo de evidencia que se regenera con un comando.</w:t>
       </w:r>
     </w:p>
     <w:p>
@@ -11481,6 +11463,74 @@
     <w:p>
       <w:pPr>
         <w:spacing w:after="0" w:line="480" w:lineRule="auto"/>
+        <w:ind w:left="720"/>
+      </w:pPr>
+      <w:r>
+        <w:rPr>
+          <w:rFonts w:ascii="Times New Roman" w:cs="Times New Roman" w:eastAsia="Times New Roman" w:hAnsi="Times New Roman"/>
+          <w:b/>
+          <w:bCs/>
+          <w:color w:val="000000"/>
+          <w:sz w:val="24"/>
+          <w:szCs w:val="24"/>
+        </w:rPr>
+        <w:t xml:space="preserve">Las cuatro filas donde entra el iTransformer se leen con la </w:t>
+      </w:r>
+      <w:r>
+        <w:rPr>
+          <w:rFonts w:ascii="Times New Roman" w:cs="Times New Roman" w:eastAsia="Times New Roman" w:hAnsi="Times New Roman"/>
+          <w:b/>
+          <w:bCs/>
+          <w:color w:val="000000"/>
+          <w:sz w:val="24"/>
+          <w:szCs w:val="24"/>
+        </w:rPr>
+        <w:t xml:space="preserve">D25</w:t>
+      </w:r>
+      <w:r>
+        <w:rPr>
+          <w:rFonts w:ascii="Times New Roman" w:cs="Times New Roman" w:eastAsia="Times New Roman" w:hAnsi="Times New Roman"/>
+          <w:b/>
+          <w:bCs/>
+          <w:color w:val="000000"/>
+          <w:sz w:val="24"/>
+          <w:szCs w:val="24"/>
+        </w:rPr>
+        <w:t xml:space="preserve">.</w:t>
+      </w:r>
+      <w:r>
+        <w:rPr>
+          <w:rFonts w:ascii="Times New Roman" w:cs="Times New Roman" w:eastAsia="Times New Roman" w:hAnsi="Times New Roman"/>
+          <w:color w:val="000000"/>
+          <w:sz w:val="24"/>
+          <w:szCs w:val="24"/>
+        </w:rPr>
+        <w:t xml:space="preserve"> Ese modelo no es reproducible entre procesos, así que el intervalo pareado de una corrida no decide: el peso lo lleva el signo entre semillas. Las filas de Chronos-Bolt no están afectadas, porque es </w:t>
+      </w:r>
+      <w:r>
+        <w:rPr>
+          <w:rFonts w:ascii="Times New Roman" w:cs="Times New Roman" w:eastAsia="Times New Roman" w:hAnsi="Times New Roman"/>
+          <w:i/>
+          <w:iCs/>
+          <w:color w:val="000000"/>
+          <w:sz w:val="24"/>
+          <w:szCs w:val="24"/>
+        </w:rPr>
+        <w:t xml:space="preserve">zero-shot</w:t>
+      </w:r>
+      <w:r>
+        <w:rPr>
+          <w:rFonts w:ascii="Times New Roman" w:cs="Times New Roman" w:eastAsia="Times New Roman" w:hAnsi="Times New Roman"/>
+          <w:color w:val="000000"/>
+          <w:sz w:val="24"/>
+          <w:szCs w:val="24"/>
+        </w:rPr>
+        <w:t xml:space="preserve"> y sus predicciones sí reproducen.</w:t>
+      </w:r>
+    </w:p>
+    <w:p>
+      <w:pPr>
+        <w:spacing w:after="0" w:line="480" w:lineRule="auto"/>
         <w:ind w:firstLine="720"/>
       </w:pPr>
       <w:r>
@@ -11935,7 +11985,7 @@
           <w:sz w:val="24"/>
           <w:szCs w:val="24"/>
         </w:rPr>
-        <w:t xml:space="preserve">Los activos de apoyo sí aportan al avanzado — y el matiz importa</w:t>
+        <w:t xml:space="preserve">Los activos de apoyo: signo estable en las cinco, sin distinguibilidad afirmable</w:t>
       </w:r>
     </w:p>
     <w:p>
@@ -11961,16 +12011,16 @@
           <w:sz w:val="24"/>
           <w:szCs w:val="24"/>
         </w:rPr>
-        <w:t xml:space="preserve">Eso se midió sobre el bosque, y sobre el avanzado da distinto.</w:t>
-      </w:r>
-      <w:r>
-        <w:rPr>
-          <w:rFonts w:ascii="Times New Roman" w:cs="Times New Roman" w:eastAsia="Times New Roman" w:hAnsi="Times New Roman"/>
-          <w:color w:val="000000"/>
-          <w:sz w:val="24"/>
-          <w:szCs w:val="24"/>
-        </w:rPr>
-        <w:t xml:space="preserve"> No es una generalización que convenga hacer, porque la arquitectura elegida existe justamente para atender entre series.</w:t>
+        <w:t xml:space="preserve">Se midió sobre el bosque, y sobre el avanzado hay que decirlo con más cuidado</w:t>
+      </w:r>
+      <w:r>
+        <w:rPr>
+          <w:rFonts w:ascii="Times New Roman" w:cs="Times New Roman" w:eastAsia="Times New Roman" w:hAnsi="Times New Roman"/>
+          <w:color w:val="000000"/>
+          <w:sz w:val="24"/>
+          <w:szCs w:val="24"/>
+        </w:rPr>
+        <w:t xml:space="preserve">, porque la arquitectura elegida existe justamente para atender entre series y es donde uno esperaría ver el aporte si lo hay.</w:t>
       </w:r>
     </w:p>
     <w:p>
@@ -11985,7 +12035,27 @@
           <w:sz w:val="24"/>
           <w:szCs w:val="24"/>
         </w:rPr>
-        <w:t xml:space="preserve">La D14 —mía— había concluido lo contrario, y la D24 corrige esa lectura sin reescribirla: la D14 respondió una pregunta de </w:t>
+        <w:t xml:space="preserve">Esta sección pasó por dos correcciones y conviene que se lean juntas. La </w:t>
+      </w:r>
+      <w:r>
+        <w:rPr>
+          <w:rFonts w:ascii="Times New Roman" w:cs="Times New Roman" w:eastAsia="Times New Roman" w:hAnsi="Times New Roman"/>
+          <w:b/>
+          <w:bCs/>
+          <w:color w:val="000000"/>
+          <w:sz w:val="24"/>
+          <w:szCs w:val="24"/>
+        </w:rPr>
+        <w:t xml:space="preserve">D24</w:t>
+      </w:r>
+      <w:r>
+        <w:rPr>
+          <w:rFonts w:ascii="Times New Roman" w:cs="Times New Roman" w:eastAsia="Times New Roman" w:hAnsi="Times New Roman"/>
+          <w:color w:val="000000"/>
+          <w:sz w:val="24"/>
+          <w:szCs w:val="24"/>
+        </w:rPr>
+        <w:t xml:space="preserve"> corrigió el criterio de la D14 —mía—, que había respondido una pregunta de </w:t>
       </w:r>
       <w:r>
         <w:rPr>
@@ -12025,7 +12095,47 @@
           <w:sz w:val="24"/>
           <w:szCs w:val="24"/>
         </w:rPr>
-        <w:t xml:space="preserve">. La sección 5 del protocolo ya decía que ese umbral no aplica a esta clase de pregunta.</w:t>
+        <w:t xml:space="preserve">. Esa corrección sigue en pie. La </w:t>
+      </w:r>
+      <w:r>
+        <w:rPr>
+          <w:rFonts w:ascii="Times New Roman" w:cs="Times New Roman" w:eastAsia="Times New Roman" w:hAnsi="Times New Roman"/>
+          <w:b/>
+          <w:bCs/>
+          <w:color w:val="000000"/>
+          <w:sz w:val="24"/>
+          <w:szCs w:val="24"/>
+        </w:rPr>
+        <w:t xml:space="preserve">D25</w:t>
+      </w:r>
+      <w:r>
+        <w:rPr>
+          <w:rFonts w:ascii="Times New Roman" w:cs="Times New Roman" w:eastAsia="Times New Roman" w:hAnsi="Times New Roman"/>
+          <w:color w:val="000000"/>
+          <w:sz w:val="24"/>
+          <w:szCs w:val="24"/>
+        </w:rPr>
+        <w:t xml:space="preserve"> retiró el veredicto que la D24 sacó de ahí, porque la condición que lo sostenía no se reproduce. </w:t>
+      </w:r>
+      <w:r>
+        <w:rPr>
+          <w:rFonts w:ascii="Times New Roman" w:cs="Times New Roman" w:eastAsia="Times New Roman" w:hAnsi="Times New Roman"/>
+          <w:b/>
+          <w:bCs/>
+          <w:color w:val="000000"/>
+          <w:sz w:val="24"/>
+          <w:szCs w:val="24"/>
+        </w:rPr>
+        <w:t xml:space="preserve">La conclusión vuelve a coincidir con la D14 por una razón distinta de la que la D14 dio</w:t>
+      </w:r>
+      <w:r>
+        <w:rPr>
+          <w:rFonts w:ascii="Times New Roman" w:cs="Times New Roman" w:eastAsia="Times New Roman" w:hAnsi="Times New Roman"/>
+          <w:color w:val="000000"/>
+          <w:sz w:val="24"/>
+          <w:szCs w:val="24"/>
+        </w:rPr>
+        <w:t xml:space="preserve">, y eso no vuelve correcto el argumento de entonces.</w:t>
       </w:r>
     </w:p>
     <w:p>
@@ -12216,7 +12326,7 @@
           <w:sz w:val="24"/>
           <w:szCs w:val="24"/>
         </w:rPr>
-        <w:t xml:space="preserve">Y aun así no rescata nada.</w:t>
+        <w:t xml:space="preserve">Y aun así no rescataría nada.</w:t>
       </w:r>
       <w:r>
         <w:rPr>
@@ -12265,7 +12375,7 @@
           <w:sz w:val="24"/>
           <w:szCs w:val="24"/>
         </w:rPr>
-        <w:t xml:space="preserve"> ellos. Las dos frases son ciertas a la vez y hay que decirlas juntas:</w:t>
+        <w:t xml:space="preserve"> ellos. Las dos cosas son ciertas a la vez y hay que decirlas juntas:</w:t>
       </w:r>
     </w:p>
     <w:p>
@@ -12280,7 +12390,47 @@
           <w:sz w:val="24"/>
           <w:szCs w:val="24"/>
         </w:rPr>
-        <w:t xml:space="preserve">Los activos de apoyo aportan al modelo avanzado de forma consistente, y el aporte es pequeño. La D20 explica por qué: los seis son fuertemente proporcionales entre sí y </w:t>
+        <w:t xml:space="preserve">El aporte de los activos de apoyo al modelo avanzado tiene </w:t>
+      </w:r>
+      <w:r>
+        <w:rPr>
+          <w:rFonts w:ascii="Times New Roman" w:cs="Times New Roman" w:eastAsia="Times New Roman" w:hAnsi="Times New Roman"/>
+          <w:b/>
+          <w:bCs/>
+          <w:color w:val="000000"/>
+          <w:sz w:val="24"/>
+          <w:szCs w:val="24"/>
+        </w:rPr>
+        <w:t xml:space="preserve">signo estable en las cinco semillas de dos barridos independientes</w:t>
+      </w:r>
+      <w:r>
+        <w:rPr>
+          <w:rFonts w:ascii="Times New Roman" w:cs="Times New Roman" w:eastAsia="Times New Roman" w:hAnsi="Times New Roman"/>
+          <w:color w:val="000000"/>
+          <w:sz w:val="24"/>
+          <w:szCs w:val="24"/>
+        </w:rPr>
+        <w:t xml:space="preserve">, y </w:t>
+      </w:r>
+      <w:r>
+        <w:rPr>
+          <w:rFonts w:ascii="Times New Roman" w:cs="Times New Roman" w:eastAsia="Times New Roman" w:hAnsi="Times New Roman"/>
+          <w:b/>
+          <w:bCs/>
+          <w:color w:val="000000"/>
+          <w:sz w:val="24"/>
+          <w:szCs w:val="24"/>
+        </w:rPr>
+        <w:t xml:space="preserve">no se puede afirmar que sea distinguible del azar</w:t>
+      </w:r>
+      <w:r>
+        <w:rPr>
+          <w:rFonts w:ascii="Times New Roman" w:cs="Times New Roman" w:eastAsia="Times New Roman" w:hAnsi="Times New Roman"/>
+          <w:color w:val="000000"/>
+          <w:sz w:val="24"/>
+          <w:szCs w:val="24"/>
+        </w:rPr>
+        <w:t xml:space="preserve"> por el estándar que el equipo fijó. La D20 explica por qué sería pequeño aunque lo fuera: los seis son fuertemente proporcionales entre sí y </w:t>
       </w:r>
       <w:r>
         <w:rPr>
@@ -12480,7 +12630,7 @@
           <w:sz w:val="24"/>
           <w:szCs w:val="24"/>
         </w:rPr>
-        <w:t xml:space="preserve">7. La celda que falta, y las tres lecturas escritas de antemano</w:t>
+        <w:t xml:space="preserve">7. Sobre el bloque de prueba: los dos modelos fallan en clases opuestas</w:t>
       </w:r>
     </w:p>
     <w:p>
@@ -12495,63 +12645,7 @@
           <w:sz w:val="24"/>
           <w:szCs w:val="24"/>
         </w:rPr>
-        <w:t xml:space="preserve">Sobre el bloque de prueba se mide </w:t>
-      </w:r>
-      <w:r>
-        <w:rPr>
-          <w:rFonts w:ascii="Times New Roman" w:cs="Times New Roman" w:eastAsia="Times New Roman" w:hAnsi="Times New Roman"/>
-          <w:b/>
-          <w:bCs/>
-          <w:color w:val="000000"/>
-          <w:sz w:val="24"/>
-          <w:szCs w:val="24"/>
-        </w:rPr>
-        <w:t xml:space="preserve">una configuración por familia</w:t>
-      </w:r>
-      <w:r>
-        <w:rPr>
-          <w:rFonts w:ascii="Times New Roman" w:cs="Times New Roman" w:eastAsia="Times New Roman" w:hAnsi="Times New Roman"/>
-          <w:color w:val="000000"/>
-          <w:sz w:val="24"/>
-          <w:szCs w:val="24"/>
-        </w:rPr>
-        <w:t xml:space="preserve">, congelada antes de correr nada: </w:t>
-      </w:r>
-      <w:r>
-        <w:rPr>
-          <w:rFonts w:ascii="Courier New" w:cs="Courier New" w:eastAsia="Courier New" w:hAnsi="Courier New"/>
-          <w:color w:val="000000"/>
-          <w:sz w:val="22"/>
-          <w:szCs w:val="22"/>
-        </w:rPr>
-        <w:t xml:space="preserve">chronos_bolt</w:t>
-      </w:r>
-      <w:r>
-        <w:rPr>
-          <w:rFonts w:ascii="Times New Roman" w:cs="Times New Roman" w:eastAsia="Times New Roman" w:hAnsi="Times New Roman"/>
-          <w:color w:val="000000"/>
-          <w:sz w:val="24"/>
-          <w:szCs w:val="24"/>
-        </w:rPr>
-        <w:t xml:space="preserve"> por omisión y </w:t>
-      </w:r>
-      <w:r>
-        <w:rPr>
-          <w:rFonts w:ascii="Courier New" w:cs="Courier New" w:eastAsia="Courier New" w:hAnsi="Courier New"/>
-          <w:color w:val="000000"/>
-          <w:sz w:val="22"/>
-          <w:szCs w:val="22"/>
-        </w:rPr>
-        <w:t xml:space="preserve">itransformer</w:t>
-      </w:r>
-      <w:r>
-        <w:rPr>
-          <w:rFonts w:ascii="Times New Roman" w:cs="Times New Roman" w:eastAsia="Times New Roman" w:hAnsi="Times New Roman"/>
-          <w:color w:val="000000"/>
-          <w:sz w:val="24"/>
-          <w:szCs w:val="24"/>
-        </w:rPr>
-        <w:t xml:space="preserve"> con lookback 96 y dimensión 64. Sin variantes.</w:t>
+        <w:t xml:space="preserve">Esto no aparece al mirar el F1 macro, y es lo más preciso que se puede decir del resultado final.</w:t>
       </w:r>
     </w:p>
     <w:p>
@@ -12562,31 +12656,22 @@
       <w:r>
         <w:rPr>
           <w:rFonts w:ascii="Times New Roman" w:cs="Times New Roman" w:eastAsia="Times New Roman" w:hAnsi="Times New Roman"/>
-          <w:color w:val="000000"/>
-          <w:sz w:val="24"/>
-          <w:szCs w:val="24"/>
-        </w:rPr>
-        <w:t xml:space="preserve">Las tres lecturas posibles ya están escritas en la sección 6 del protocolo, </w:t>
-      </w:r>
-      <w:r>
-        <w:rPr>
-          <w:rFonts w:ascii="Times New Roman" w:cs="Times New Roman" w:eastAsia="Times New Roman" w:hAnsi="Times New Roman"/>
-          <w:b/>
-          <w:bCs/>
-          <w:color w:val="000000"/>
-          <w:sz w:val="24"/>
-          <w:szCs w:val="24"/>
-        </w:rPr>
-        <w:t xml:space="preserve">antes de conocer el resultado</w:t>
-      </w:r>
-      <w:r>
-        <w:rPr>
-          <w:rFonts w:ascii="Times New Roman" w:cs="Times New Roman" w:eastAsia="Times New Roman" w:hAnsi="Times New Roman"/>
-          <w:color w:val="000000"/>
-          <w:sz w:val="24"/>
-          <w:szCs w:val="24"/>
-        </w:rPr>
-        <w:t xml:space="preserve">, y el informe reporta la primera y única cifra que salga en los tres casos. No hay una cuarta rama en la que se busque otra configuración.</w:t>
+          <w:b/>
+          <w:bCs/>
+          <w:color w:val="000000"/>
+          <w:sz w:val="24"/>
+          <w:szCs w:val="24"/>
+        </w:rPr>
+        <w:t xml:space="preserve">Tabla.</w:t>
+      </w:r>
+      <w:r>
+        <w:rPr>
+          <w:rFonts w:ascii="Times New Roman" w:cs="Times New Roman" w:eastAsia="Times New Roman" w:hAnsi="Times New Roman"/>
+          <w:color w:val="000000"/>
+          <w:sz w:val="24"/>
+          <w:szCs w:val="24"/>
+        </w:rPr>
+        <w:t xml:space="preserve"> F1 por clase extrema sobre el bloque de prueba, contra el piso del azar.</w:t>
       </w:r>
     </w:p>
     <w:p>
@@ -12601,27 +12686,114 @@
           <w:sz w:val="24"/>
           <w:szCs w:val="24"/>
         </w:rPr>
-        <w:t xml:space="preserve">Dicho sin adornos: sobre validación </w:t>
-      </w:r>
-      <w:r>
-        <w:rPr>
-          <w:rFonts w:ascii="Times New Roman" w:cs="Times New Roman" w:eastAsia="Times New Roman" w:hAnsi="Times New Roman"/>
-          <w:b/>
-          <w:bCs/>
-          <w:color w:val="000000"/>
-          <w:sz w:val="24"/>
-          <w:szCs w:val="24"/>
-        </w:rPr>
-        <w:t xml:space="preserve">ninguno de los dos modelos de M3 supera al azar de forma distinguible</w:t>
-      </w:r>
-      <w:r>
-        <w:rPr>
-          <w:rFonts w:ascii="Times New Roman" w:cs="Times New Roman" w:eastAsia="Times New Roman" w:hAnsi="Times New Roman"/>
-          <w:color w:val="000000"/>
-          <w:sz w:val="24"/>
-          <w:szCs w:val="24"/>
-        </w:rPr>
-        <w:t xml:space="preserve">, y el avanzado queda por debajo del bosque clásico en las cinco semillas. Esperar que el bloque de prueba mejore eso sería esperar que datos no vistos favorezcan a un modelo más que los datos con los que se eligió, que es al revés de como funciona.</w:t>
+        <w:t xml:space="preserve">Dos lecturas que conviene no separar:</w:t>
+      </w:r>
+    </w:p>
+    <w:p>
+      <w:pPr>
+        <w:spacing w:after="0" w:line="480" w:lineRule="auto"/>
+        <w:ind w:firstLine="720"/>
+      </w:pPr>
+      <w:r>
+        <w:rPr>
+          <w:rFonts w:ascii="Times New Roman" w:cs="Times New Roman" w:eastAsia="Times New Roman" w:hAnsi="Times New Roman"/>
+          <w:b/>
+          <w:bCs/>
+          <w:color w:val="000000"/>
+          <w:sz w:val="24"/>
+          <w:szCs w:val="24"/>
+        </w:rPr>
+        <w:t xml:space="preserve">Ningún modelo supera al azar en las dos clases extremas.</w:t>
+      </w:r>
+      <w:r>
+        <w:rPr>
+          <w:rFonts w:ascii="Times New Roman" w:cs="Times New Roman" w:eastAsia="Times New Roman" w:hAnsi="Times New Roman"/>
+          <w:color w:val="000000"/>
+          <w:sz w:val="24"/>
+          <w:szCs w:val="24"/>
+        </w:rPr>
+        <w:t xml:space="preserve"> El bosque le gana holgadamente en Mínimo y queda </w:t>
+      </w:r>
+      <w:r>
+        <w:rPr>
+          <w:rFonts w:ascii="Times New Roman" w:cs="Times New Roman" w:eastAsia="Times New Roman" w:hAnsi="Times New Roman"/>
+          <w:b/>
+          <w:bCs/>
+          <w:color w:val="000000"/>
+          <w:sz w:val="24"/>
+          <w:szCs w:val="24"/>
+        </w:rPr>
+        <w:t xml:space="preserve">por debajo del azar</w:t>
+      </w:r>
+      <w:r>
+        <w:rPr>
+          <w:rFonts w:ascii="Times New Roman" w:cs="Times New Roman" w:eastAsia="Times New Roman" w:hAnsi="Times New Roman"/>
+          <w:color w:val="000000"/>
+          <w:sz w:val="24"/>
+          <w:szCs w:val="24"/>
+        </w:rPr>
+        <w:t xml:space="preserve"> en Máximo; el fundacional queda por debajo en Máximo; y el avanzado queda por debajo en Mínimo. Es la forma más exacta del resultado negativo, y más severa que mirar solo el F1 macro: no es que el sistema detecte poco, es que </w:t>
+      </w:r>
+      <w:r>
+        <w:rPr>
+          <w:rFonts w:ascii="Times New Roman" w:cs="Times New Roman" w:eastAsia="Times New Roman" w:hAnsi="Times New Roman"/>
+          <w:b/>
+          <w:bCs/>
+          <w:color w:val="000000"/>
+          <w:sz w:val="24"/>
+          <w:szCs w:val="24"/>
+        </w:rPr>
+        <w:t xml:space="preserve">ningún modelo detecta las dos cosas que hay que detectar</w:t>
+      </w:r>
+      <w:r>
+        <w:rPr>
+          <w:rFonts w:ascii="Times New Roman" w:cs="Times New Roman" w:eastAsia="Times New Roman" w:hAnsi="Times New Roman"/>
+          <w:color w:val="000000"/>
+          <w:sz w:val="24"/>
+          <w:szCs w:val="24"/>
+        </w:rPr>
+        <w:t xml:space="preserve">.</w:t>
+      </w:r>
+    </w:p>
+    <w:p>
+      <w:pPr>
+        <w:spacing w:after="0" w:line="480" w:lineRule="auto"/>
+        <w:ind w:firstLine="720"/>
+      </w:pPr>
+      <w:r>
+        <w:rPr>
+          <w:rFonts w:ascii="Times New Roman" w:cs="Times New Roman" w:eastAsia="Times New Roman" w:hAnsi="Times New Roman"/>
+          <w:b/>
+          <w:bCs/>
+          <w:color w:val="000000"/>
+          <w:sz w:val="24"/>
+          <w:szCs w:val="24"/>
+        </w:rPr>
+        <w:t xml:space="preserve">Y el único que supera al azar en Máximo es el avanzado</w:t>
+      </w:r>
+      <w:r>
+        <w:rPr>
+          <w:rFonts w:ascii="Times New Roman" w:cs="Times New Roman" w:eastAsia="Times New Roman" w:hAnsi="Times New Roman"/>
+          <w:color w:val="000000"/>
+          <w:sz w:val="24"/>
+          <w:szCs w:val="24"/>
+        </w:rPr>
+        <w:t xml:space="preserve">, que es el que pierde en F1 macro. La clase donde el mejor modelo falla es justamente donde el modelo que el enunciado pedía no falla. Decirlo importa en las dos direcciones: es un punto a favor del profundo que el F1 macro esconde, y es la razón por la que promediar las dos clases en una sola métrica puede hacer parecer que un modelo detecta cuando lo que hace es compensar.</w:t>
+      </w:r>
+    </w:p>
+    <w:p>
+      <w:pPr>
+        <w:spacing w:after="0" w:line="480" w:lineRule="auto"/>
+        <w:ind w:firstLine="720"/>
+      </w:pPr>
+      <w:r>
+        <w:rPr>
+          <w:rFonts w:ascii="Times New Roman" w:cs="Times New Roman" w:eastAsia="Times New Roman" w:hAnsi="Times New Roman"/>
+          <w:color w:val="000000"/>
+          <w:sz w:val="24"/>
+          <w:szCs w:val="24"/>
+        </w:rPr>
+        <w:t xml:space="preserve">No se saca de aquí ninguna configuración nueva ni se propone combinarlos: la sección 7 del protocolo lo prohíbe y esto se reporta como lo que es, una lectura de la única corrida.</w:t>
       </w:r>
     </w:p>
     <w:p>
@@ -12641,7 +12813,194 @@
           <w:sz w:val="24"/>
           <w:szCs w:val="24"/>
         </w:rPr>
-        <w:t xml:space="preserve">8. Cómo se regenera cada cifra</w:t>
+        <w:t xml:space="preserve">8. La celda que faltaba, y las tres lecturas escritas de antemano</w:t>
+      </w:r>
+    </w:p>
+    <w:p>
+      <w:pPr>
+        <w:spacing w:after="0" w:line="480" w:lineRule="auto"/>
+        <w:ind w:firstLine="720"/>
+      </w:pPr>
+      <w:r>
+        <w:rPr>
+          <w:rFonts w:ascii="Times New Roman" w:cs="Times New Roman" w:eastAsia="Times New Roman" w:hAnsi="Times New Roman"/>
+          <w:color w:val="000000"/>
+          <w:sz w:val="24"/>
+          <w:szCs w:val="24"/>
+        </w:rPr>
+        <w:t xml:space="preserve">Sobre el bloque de prueba se mide </w:t>
+      </w:r>
+      <w:r>
+        <w:rPr>
+          <w:rFonts w:ascii="Times New Roman" w:cs="Times New Roman" w:eastAsia="Times New Roman" w:hAnsi="Times New Roman"/>
+          <w:b/>
+          <w:bCs/>
+          <w:color w:val="000000"/>
+          <w:sz w:val="24"/>
+          <w:szCs w:val="24"/>
+        </w:rPr>
+        <w:t xml:space="preserve">una configuración por familia</w:t>
+      </w:r>
+      <w:r>
+        <w:rPr>
+          <w:rFonts w:ascii="Times New Roman" w:cs="Times New Roman" w:eastAsia="Times New Roman" w:hAnsi="Times New Roman"/>
+          <w:color w:val="000000"/>
+          <w:sz w:val="24"/>
+          <w:szCs w:val="24"/>
+        </w:rPr>
+        <w:t xml:space="preserve">, congelada antes de correr nada: </w:t>
+      </w:r>
+      <w:r>
+        <w:rPr>
+          <w:rFonts w:ascii="Courier New" w:cs="Courier New" w:eastAsia="Courier New" w:hAnsi="Courier New"/>
+          <w:color w:val="000000"/>
+          <w:sz w:val="22"/>
+          <w:szCs w:val="22"/>
+        </w:rPr>
+        <w:t xml:space="preserve">chronos_bolt</w:t>
+      </w:r>
+      <w:r>
+        <w:rPr>
+          <w:rFonts w:ascii="Times New Roman" w:cs="Times New Roman" w:eastAsia="Times New Roman" w:hAnsi="Times New Roman"/>
+          <w:color w:val="000000"/>
+          <w:sz w:val="24"/>
+          <w:szCs w:val="24"/>
+        </w:rPr>
+        <w:t xml:space="preserve"> por omisión y </w:t>
+      </w:r>
+      <w:r>
+        <w:rPr>
+          <w:rFonts w:ascii="Courier New" w:cs="Courier New" w:eastAsia="Courier New" w:hAnsi="Courier New"/>
+          <w:color w:val="000000"/>
+          <w:sz w:val="22"/>
+          <w:szCs w:val="22"/>
+        </w:rPr>
+        <w:t xml:space="preserve">itransformer</w:t>
+      </w:r>
+      <w:r>
+        <w:rPr>
+          <w:rFonts w:ascii="Times New Roman" w:cs="Times New Roman" w:eastAsia="Times New Roman" w:hAnsi="Times New Roman"/>
+          <w:color w:val="000000"/>
+          <w:sz w:val="24"/>
+          <w:szCs w:val="24"/>
+        </w:rPr>
+        <w:t xml:space="preserve"> con lookback 96 y dimensión 64. Sin variantes.</w:t>
+      </w:r>
+    </w:p>
+    <w:p>
+      <w:pPr>
+        <w:spacing w:after="0" w:line="480" w:lineRule="auto"/>
+        <w:ind w:firstLine="720"/>
+      </w:pPr>
+      <w:r>
+        <w:rPr>
+          <w:rFonts w:ascii="Times New Roman" w:cs="Times New Roman" w:eastAsia="Times New Roman" w:hAnsi="Times New Roman"/>
+          <w:color w:val="000000"/>
+          <w:sz w:val="24"/>
+          <w:szCs w:val="24"/>
+        </w:rPr>
+        <w:t xml:space="preserve">Las tres lecturas posibles ya están escritas en la sección 6 del protocolo, </w:t>
+      </w:r>
+      <w:r>
+        <w:rPr>
+          <w:rFonts w:ascii="Times New Roman" w:cs="Times New Roman" w:eastAsia="Times New Roman" w:hAnsi="Times New Roman"/>
+          <w:b/>
+          <w:bCs/>
+          <w:color w:val="000000"/>
+          <w:sz w:val="24"/>
+          <w:szCs w:val="24"/>
+        </w:rPr>
+        <w:t xml:space="preserve">antes de conocer el resultado</w:t>
+      </w:r>
+      <w:r>
+        <w:rPr>
+          <w:rFonts w:ascii="Times New Roman" w:cs="Times New Roman" w:eastAsia="Times New Roman" w:hAnsi="Times New Roman"/>
+          <w:color w:val="000000"/>
+          <w:sz w:val="24"/>
+          <w:szCs w:val="24"/>
+        </w:rPr>
+        <w:t xml:space="preserve">, y el informe reporta la primera y única cifra que salga en los tres casos. No hay una cuarta rama en la que se busque otra configuración.</w:t>
+      </w:r>
+    </w:p>
+    <w:p>
+      <w:pPr>
+        <w:spacing w:after="0" w:line="480" w:lineRule="auto"/>
+        <w:ind w:firstLine="720"/>
+      </w:pPr>
+      <w:r>
+        <w:rPr>
+          <w:rFonts w:ascii="Times New Roman" w:cs="Times New Roman" w:eastAsia="Times New Roman" w:hAnsi="Times New Roman"/>
+          <w:color w:val="000000"/>
+          <w:sz w:val="24"/>
+          <w:szCs w:val="24"/>
+        </w:rPr>
+        <w:t xml:space="preserve">Dicho sin adornos: sobre validación </w:t>
+      </w:r>
+      <w:r>
+        <w:rPr>
+          <w:rFonts w:ascii="Times New Roman" w:cs="Times New Roman" w:eastAsia="Times New Roman" w:hAnsi="Times New Roman"/>
+          <w:b/>
+          <w:bCs/>
+          <w:color w:val="000000"/>
+          <w:sz w:val="24"/>
+          <w:szCs w:val="24"/>
+        </w:rPr>
+        <w:t xml:space="preserve">ninguno de los dos modelos de M3 supera al azar de forma distinguible</w:t>
+      </w:r>
+      <w:r>
+        <w:rPr>
+          <w:rFonts w:ascii="Times New Roman" w:cs="Times New Roman" w:eastAsia="Times New Roman" w:hAnsi="Times New Roman"/>
+          <w:color w:val="000000"/>
+          <w:sz w:val="24"/>
+          <w:szCs w:val="24"/>
+        </w:rPr>
+        <w:t xml:space="preserve">, y el avanzado queda por debajo del bosque clásico en las cinco semillas.</w:t>
+      </w:r>
+    </w:p>
+    <w:p>
+      <w:pPr>
+        <w:spacing w:after="0" w:line="480" w:lineRule="auto"/>
+        <w:ind w:firstLine="720"/>
+      </w:pPr>
+      <w:r>
+        <w:rPr>
+          <w:rFonts w:ascii="Times New Roman" w:cs="Times New Roman" w:eastAsia="Times New Roman" w:hAnsi="Times New Roman"/>
+          <w:b/>
+          <w:bCs/>
+          <w:color w:val="000000"/>
+          <w:sz w:val="24"/>
+          <w:szCs w:val="24"/>
+        </w:rPr>
+        <w:t xml:space="preserve">La expectativa se escribió antes y se cumplió.</w:t>
+      </w:r>
+      <w:r>
+        <w:rPr>
+          <w:rFonts w:ascii="Times New Roman" w:cs="Times New Roman" w:eastAsia="Times New Roman" w:hAnsi="Times New Roman"/>
+          <w:color w:val="000000"/>
+          <w:sz w:val="24"/>
+          <w:szCs w:val="24"/>
+        </w:rPr>
+        <w:t xml:space="preserve"> Aquí decía que esperar que el bloque de prueba mejorara lo de validación sería esperar que datos no vistos favorezcan a un modelo más que los datos con los que se eligió. La corrida del 07/09 dio el mismo orden que validación, y de las tres condiciones se cumplieron dos. Que la predicción incómoda se cumpliera no es un consuelo, pero sí es la comprobación de que el criterio no se acomodó al resultado.</w:t>
+      </w:r>
+    </w:p>
+    <w:p>
+      <w:pPr>
+        <w:pStyle w:val="Heading2"/>
+        <w:keepNext/>
+        <w:spacing w:after="0" w:before="0" w:line="480" w:lineRule="auto"/>
+      </w:pPr>
+      <w:r>
+        <w:rPr>
+          <w:rFonts w:ascii="Times New Roman" w:cs="Times New Roman" w:eastAsia="Times New Roman" w:hAnsi="Times New Roman"/>
+          <w:b/>
+          <w:bCs/>
+          <w:i w:val="false"/>
+          <w:iCs w:val="false"/>
+          <w:color w:val="000000"/>
+          <w:sz w:val="24"/>
+          <w:szCs w:val="24"/>
+        </w:rPr>
+        <w:t xml:space="preserve">9. Cómo se regenera cada cifra</w:t>
       </w:r>
     </w:p>
     <w:p>

</xml_diff>

<commit_message>
Semana 5 al dia con el alcance medido de la lectura por clase (#123)
Co-Authored-By: Claude Opus 5 <noreply@anthropic.com>
Claude-Session: https://claude.ai/code/session_01YBrT6YULjQyRaZRYdhHbQc
</commit_message>
<xml_diff>
--- a/docs/entregas/semana-5/Caso 1 - Semana 5 - Informe final.docx
+++ b/docs/entregas/semana-5/Caso 1 - Semana 5 - Informe final.docx
@@ -12794,6 +12794,167 @@
           <w:szCs w:val="24"/>
         </w:rPr>
         <w:t xml:space="preserve">No se saca de aquí ninguna configuración nueva ni se propone combinarlos: la sección 7 del protocolo lo prohíbe y esto se reporta como lo que es, una lectura de la única corrida.</w:t>
+      </w:r>
+    </w:p>
+    <w:p>
+      <w:pPr>
+        <w:spacing w:after="0" w:line="480" w:lineRule="auto"/>
+        <w:ind w:firstLine="720"/>
+      </w:pPr>
+      <w:r>
+        <w:rPr>
+          <w:rFonts w:ascii="Times New Roman" w:cs="Times New Roman" w:eastAsia="Times New Roman" w:hAnsi="Times New Roman"/>
+          <w:b/>
+          <w:bCs/>
+          <w:color w:val="000000"/>
+          <w:sz w:val="24"/>
+          <w:szCs w:val="24"/>
+        </w:rPr>
+        <w:t xml:space="preserve">Y hay que decir cuánto pesa esa advertencia, porque está medida.</w:t>
+      </w:r>
+      <w:r>
+        <w:rPr>
+          <w:rFonts w:ascii="Times New Roman" w:cs="Times New Roman" w:eastAsia="Times New Roman" w:hAnsi="Times New Roman"/>
+          <w:color w:val="000000"/>
+          <w:sz w:val="24"/>
+          <w:szCs w:val="24"/>
+        </w:rPr>
+        <w:t xml:space="preserve"> El walk-forward de los nueve tramos comprobó, sobre el bosque, que la asimetría entre las dos clases extremas </w:t>
+      </w:r>
+      <w:r>
+        <w:rPr>
+          <w:rFonts w:ascii="Times New Roman" w:cs="Times New Roman" w:eastAsia="Times New Roman" w:hAnsi="Times New Roman"/>
+          <w:b/>
+          <w:bCs/>
+          <w:color w:val="000000"/>
+          <w:sz w:val="24"/>
+          <w:szCs w:val="24"/>
+        </w:rPr>
+        <w:t xml:space="preserve">no es estable</w:t>
+      </w:r>
+      <w:r>
+        <w:rPr>
+          <w:rFonts w:ascii="Times New Roman" w:cs="Times New Roman" w:eastAsia="Times New Roman" w:hAnsi="Times New Roman"/>
+          <w:color w:val="000000"/>
+          <w:sz w:val="24"/>
+          <w:szCs w:val="24"/>
+        </w:rPr>
+        <w:t xml:space="preserve">: el F1 de mínimos supera al de máximos en </w:t>
+      </w:r>
+      <w:r>
+        <w:rPr>
+          <w:rFonts w:ascii="Times New Roman" w:cs="Times New Roman" w:eastAsia="Times New Roman" w:hAnsi="Times New Roman"/>
+          <w:b/>
+          <w:bCs/>
+          <w:color w:val="000000"/>
+          <w:sz w:val="24"/>
+          <w:szCs w:val="24"/>
+        </w:rPr>
+        <w:t xml:space="preserve">5 de 9</w:t>
+      </w:r>
+      <w:r>
+        <w:rPr>
+          <w:rFonts w:ascii="Times New Roman" w:cs="Times New Roman" w:eastAsia="Times New Roman" w:hAnsi="Times New Roman"/>
+          <w:color w:val="000000"/>
+          <w:sz w:val="24"/>
+          <w:szCs w:val="24"/>
+        </w:rPr>
+        <w:t xml:space="preserve"> tramos, que es lo que daría una moneda. En </w:t>
+      </w:r>
+      <w:r>
+        <w:rPr>
+          <w:rFonts w:ascii="Times New Roman" w:cs="Times New Roman" w:eastAsia="Times New Roman" w:hAnsi="Times New Roman"/>
+          <w:b/>
+          <w:bCs/>
+          <w:color w:val="000000"/>
+          <w:sz w:val="24"/>
+          <w:szCs w:val="24"/>
+        </w:rPr>
+        <w:t xml:space="preserve">dos</w:t>
+      </w:r>
+      <w:r>
+        <w:rPr>
+          <w:rFonts w:ascii="Times New Roman" w:cs="Times New Roman" w:eastAsia="Times New Roman" w:hAnsi="Times New Roman"/>
+          <w:color w:val="000000"/>
+          <w:sz w:val="24"/>
+          <w:szCs w:val="24"/>
+        </w:rPr>
+        <w:t xml:space="preserve"> de los nueve, una de las dos clases dio </w:t>
+      </w:r>
+      <w:r>
+        <w:rPr>
+          <w:rFonts w:ascii="Times New Roman" w:cs="Times New Roman" w:eastAsia="Times New Roman" w:hAnsi="Times New Roman"/>
+          <w:b/>
+          <w:bCs/>
+          <w:color w:val="000000"/>
+          <w:sz w:val="24"/>
+          <w:szCs w:val="24"/>
+        </w:rPr>
+        <w:t xml:space="preserve">0,000000</w:t>
+      </w:r>
+      <w:r>
+        <w:rPr>
+          <w:rFonts w:ascii="Times New Roman" w:cs="Times New Roman" w:eastAsia="Times New Roman" w:hAnsi="Times New Roman"/>
+          <w:color w:val="000000"/>
+          <w:sz w:val="24"/>
+          <w:szCs w:val="24"/>
+        </w:rPr>
+        <w:t xml:space="preserve"> exacto — con menos de cien ejemplos por clase, la métrica por clase puede colapsar entera.</w:t>
+      </w:r>
+    </w:p>
+    <w:p>
+      <w:pPr>
+        <w:spacing w:after="0" w:line="480" w:lineRule="auto"/>
+        <w:ind w:firstLine="720"/>
+      </w:pPr>
+      <w:r>
+        <w:rPr>
+          <w:rFonts w:ascii="Times New Roman" w:cs="Times New Roman" w:eastAsia="Times New Roman" w:hAnsi="Times New Roman"/>
+          <w:color w:val="000000"/>
+          <w:sz w:val="24"/>
+          <w:szCs w:val="24"/>
+        </w:rPr>
+        <w:t xml:space="preserve">Los modelos profundos </w:t>
+      </w:r>
+      <w:r>
+        <w:rPr>
+          <w:rFonts w:ascii="Times New Roman" w:cs="Times New Roman" w:eastAsia="Times New Roman" w:hAnsi="Times New Roman"/>
+          <w:b/>
+          <w:bCs/>
+          <w:color w:val="000000"/>
+          <w:sz w:val="24"/>
+          <w:szCs w:val="24"/>
+        </w:rPr>
+        <w:t xml:space="preserve">no se midieron por clase en los nueve tramos</w:t>
+      </w:r>
+      <w:r>
+        <w:rPr>
+          <w:rFonts w:ascii="Times New Roman" w:cs="Times New Roman" w:eastAsia="Times New Roman" w:hAnsi="Times New Roman"/>
+          <w:color w:val="000000"/>
+          <w:sz w:val="24"/>
+          <w:szCs w:val="24"/>
+        </w:rPr>
+        <w:t xml:space="preserve">, así que no hay forma de saber si el patrón de esta tabla se repetiría. Lo que dice esta sección es qué pasó </w:t>
+      </w:r>
+      <w:r>
+        <w:rPr>
+          <w:rFonts w:ascii="Times New Roman" w:cs="Times New Roman" w:eastAsia="Times New Roman" w:hAnsi="Times New Roman"/>
+          <w:b/>
+          <w:bCs/>
+          <w:color w:val="000000"/>
+          <w:sz w:val="24"/>
+          <w:szCs w:val="24"/>
+        </w:rPr>
+        <w:t xml:space="preserve">en el bloque de prueba</w:t>
+      </w:r>
+      <w:r>
+        <w:rPr>
+          <w:rFonts w:ascii="Times New Roman" w:cs="Times New Roman" w:eastAsia="Times New Roman" w:hAnsi="Times New Roman"/>
+          <w:color w:val="000000"/>
+          <w:sz w:val="24"/>
+          <w:szCs w:val="24"/>
+        </w:rPr>
+        <w:t xml:space="preserve">, que es la única estimación limpia que tenemos y también un solo bloque. Leerlo como una propiedad de los modelos —«el avanzado detecta máximos y el bosque mínimos»— sería exactamente el salto que la corrección de la sección de conclusiones tuvo que deshacer: de una diferencia medida a una explicación que suena bien.</w:t>
       </w:r>
     </w:p>
     <w:p>

</xml_diff>

<commit_message>
Semana 5 al dia con la correccion de conteos del #125
Co-Authored-By: Claude Opus 5 <noreply@anthropic.com>
Claude-Session: https://claude.ai/code/session_01YBrT6YULjQyRaZRYdhHbQc
</commit_message>
<xml_diff>
--- a/docs/entregas/semana-5/Caso 1 - Semana 5 - Informe final.docx
+++ b/docs/entregas/semana-5/Caso 1 - Semana 5 - Informe final.docx
@@ -12511,7 +12511,97 @@
           <w:sz w:val="24"/>
           <w:szCs w:val="24"/>
         </w:rPr>
-        <w:t xml:space="preserve"> Una media suelta en esa columna no significa gran cosa, y por eso las tres métricas por clase se reportan siempre con su rango. Sobre el bloque de prueba será peor: tiene 86 ejemplos por clase extrema, contra los 94 de validación.</w:t>
+        <w:t xml:space="preserve"> Una media suelta en esa columna no significa gran cosa, y por eso las tres métricas por clase se reportan siempre con su rango.</w:t>
+      </w:r>
+    </w:p>
+    <w:p>
+      <w:pPr>
+        <w:spacing w:after="0" w:line="480" w:lineRule="auto"/>
+        <w:ind w:firstLine="720"/>
+      </w:pPr>
+      <w:r>
+        <w:rPr>
+          <w:rFonts w:ascii="Times New Roman" w:cs="Times New Roman" w:eastAsia="Times New Roman" w:hAnsi="Times New Roman"/>
+          <w:color w:val="000000"/>
+          <w:sz w:val="24"/>
+          <w:szCs w:val="24"/>
+        </w:rPr>
+        <w:t xml:space="preserve">Y sobre el bloque de prueba es peor, porque hay menos de donde medir. Los conteos, que </w:t>
+      </w:r>
+      <w:r>
+        <w:rPr>
+          <w:rFonts w:ascii="Times New Roman" w:cs="Times New Roman" w:eastAsia="Times New Roman" w:hAnsi="Times New Roman"/>
+          <w:b/>
+          <w:bCs/>
+          <w:color w:val="000000"/>
+          <w:sz w:val="24"/>
+          <w:szCs w:val="24"/>
+        </w:rPr>
+        <w:t xml:space="preserve">no son simétricos</w:t>
+      </w:r>
+      <w:r>
+        <w:rPr>
+          <w:rFonts w:ascii="Times New Roman" w:cs="Times New Roman" w:eastAsia="Times New Roman" w:hAnsi="Times New Roman"/>
+          <w:color w:val="000000"/>
+          <w:sz w:val="24"/>
+          <w:szCs w:val="24"/>
+        </w:rPr>
+        <w:t xml:space="preserve"> y conviene no redondearlos:</w:t>
+      </w:r>
+    </w:p>
+    <w:p>
+      <w:pPr>
+        <w:spacing w:after="0" w:line="480" w:lineRule="auto"/>
+        <w:ind w:firstLine="720"/>
+      </w:pPr>
+      <w:r>
+        <w:rPr>
+          <w:rFonts w:ascii="Times New Roman" w:cs="Times New Roman" w:eastAsia="Times New Roman" w:hAnsi="Times New Roman"/>
+          <w:color w:val="000000"/>
+          <w:sz w:val="24"/>
+          <w:szCs w:val="24"/>
+        </w:rPr>
+        <w:t xml:space="preserve">Para la clase Máximo —la de la fila conflictiva— se pasa de 99 a 86. Que la métrica por clase pueda colapsar con esos tamaños no es una precaución retórica: el walk-forward lo midió, y en </w:t>
+      </w:r>
+      <w:r>
+        <w:rPr>
+          <w:rFonts w:ascii="Times New Roman" w:cs="Times New Roman" w:eastAsia="Times New Roman" w:hAnsi="Times New Roman"/>
+          <w:b/>
+          <w:bCs/>
+          <w:color w:val="000000"/>
+          <w:sz w:val="24"/>
+          <w:szCs w:val="24"/>
+        </w:rPr>
+        <w:t xml:space="preserve">2</w:t>
+      </w:r>
+      <w:r>
+        <w:rPr>
+          <w:rFonts w:ascii="Times New Roman" w:cs="Times New Roman" w:eastAsia="Times New Roman" w:hAnsi="Times New Roman"/>
+          <w:color w:val="000000"/>
+          <w:sz w:val="24"/>
+          <w:szCs w:val="24"/>
+        </w:rPr>
+        <w:t xml:space="preserve"> de sus nueve tramos una de las dos clases dio </w:t>
+      </w:r>
+      <w:r>
+        <w:rPr>
+          <w:rFonts w:ascii="Times New Roman" w:cs="Times New Roman" w:eastAsia="Times New Roman" w:hAnsi="Times New Roman"/>
+          <w:b/>
+          <w:bCs/>
+          <w:color w:val="000000"/>
+          <w:sz w:val="24"/>
+          <w:szCs w:val="24"/>
+        </w:rPr>
+        <w:t xml:space="preserve">0,000000</w:t>
+      </w:r>
+      <w:r>
+        <w:rPr>
+          <w:rFonts w:ascii="Times New Roman" w:cs="Times New Roman" w:eastAsia="Times New Roman" w:hAnsi="Times New Roman"/>
+          <w:color w:val="000000"/>
+          <w:sz w:val="24"/>
+          <w:szCs w:val="24"/>
+        </w:rPr>
+        <w:t xml:space="preserve"> exacto.</w:t>
       </w:r>
     </w:p>
     <w:p>

</xml_diff>

<commit_message>
La 5.3 acotada, con la propuesta que M3 dejo en su PR
Isaac corrigio su capitulo contra la agregacion (#139) y dejo escrita la frase que
correspondia a mi archivo en vez de tocarlo. Va tal cual, adaptada a la numeracion nueva.

Decia: "Ninguno de los dos modelos profundos supera al azar de forma distinguible", sin
acotar sobre que. Era cierto sobre validacion y es medio falso con potencia suficiente.

Ahora dice sobre QUE bloque, y que la lectura se parte en dos cuando hay muestra: Chronos
si lo supera (+0,027769, intervalo que excluye el cero) y el iTransformer no, ni con
cuatro veces mas observaciones.

Esa segunda mitad es mas fuerte que la original, no mas debil: no superar al azar con
7.311 filas dice bastante mas que no superarlo con 1.960.

Co-Authored-By: Claude Opus 5 <noreply@anthropic.com>
Claude-Session: https://claude.ai/code/session_01YBrT6YULjQyRaZRYdhHbQc
</commit_message>
<xml_diff>
--- a/docs/entregas/semana-5/Caso 1 - Semana 5 - Informe final.docx
+++ b/docs/entregas/semana-5/Caso 1 - Semana 5 - Informe final.docx
@@ -13782,7 +13782,27 @@
           <w:sz w:val="24"/>
           <w:szCs w:val="24"/>
         </w:rPr>
-        <w:t xml:space="preserve">• Ninguno de los dos modelos profundos supera al </w:t>
+        <w:t xml:space="preserve">• Sobre </w:t>
+      </w:r>
+      <w:r>
+        <w:rPr>
+          <w:rFonts w:ascii="Times New Roman" w:cs="Times New Roman" w:eastAsia="Times New Roman" w:hAnsi="Times New Roman"/>
+          <w:b/>
+          <w:bCs/>
+          <w:color w:val="000000"/>
+          <w:sz w:val="24"/>
+          <w:szCs w:val="24"/>
+        </w:rPr>
+        <w:t xml:space="preserve">este bloque</w:t>
+      </w:r>
+      <w:r>
+        <w:rPr>
+          <w:rFonts w:ascii="Times New Roman" w:cs="Times New Roman" w:eastAsia="Times New Roman" w:hAnsi="Times New Roman"/>
+          <w:color w:val="000000"/>
+          <w:sz w:val="24"/>
+          <w:szCs w:val="24"/>
+        </w:rPr>
+        <w:t xml:space="preserve">, ninguno de los dos modelos profundos supera al </w:t>
       </w:r>
       <w:r>
         <w:rPr>
@@ -13800,7 +13820,87 @@
           <w:sz w:val="24"/>
           <w:szCs w:val="24"/>
         </w:rPr>
-        <w:t xml:space="preserve"> de forma distinguible. Le ganan en la media y el intervalo incluye el cero.</w:t>
+        <w:t xml:space="preserve"> de forma distinguible: le ganan en la media y el intervalo incluye el cero. </w:t>
+      </w:r>
+      <w:r>
+        <w:rPr>
+          <w:rFonts w:ascii="Times New Roman" w:cs="Times New Roman" w:eastAsia="Times New Roman" w:hAnsi="Times New Roman"/>
+          <w:b/>
+          <w:bCs/>
+          <w:color w:val="000000"/>
+          <w:sz w:val="24"/>
+          <w:szCs w:val="24"/>
+        </w:rPr>
+        <w:t xml:space="preserve">Esa lectura cambió al medir con más potencia</w:t>
+      </w:r>
+      <w:r>
+        <w:rPr>
+          <w:rFonts w:ascii="Times New Roman" w:cs="Times New Roman" w:eastAsia="Times New Roman" w:hAnsi="Times New Roman"/>
+          <w:color w:val="000000"/>
+          <w:sz w:val="24"/>
+          <w:szCs w:val="24"/>
+        </w:rPr>
+        <w:t xml:space="preserve">, y hay que decirlo aquí para que la tabla no se lea sola: sobre las 7 311 filas agregadas de los nueve tramos, </w:t>
+      </w:r>
+      <w:r>
+        <w:rPr>
+          <w:rFonts w:ascii="Times New Roman" w:cs="Times New Roman" w:eastAsia="Times New Roman" w:hAnsi="Times New Roman"/>
+          <w:b/>
+          <w:bCs/>
+          <w:color w:val="000000"/>
+          <w:sz w:val="24"/>
+          <w:szCs w:val="24"/>
+        </w:rPr>
+        <w:t xml:space="preserve">Chronos-Bolt sí supera al azar</w:t>
+      </w:r>
+      <w:r>
+        <w:rPr>
+          <w:rFonts w:ascii="Times New Roman" w:cs="Times New Roman" w:eastAsia="Times New Roman" w:hAnsi="Times New Roman"/>
+          <w:color w:val="000000"/>
+          <w:sz w:val="24"/>
+          <w:szCs w:val="24"/>
+        </w:rPr>
+        <w:t xml:space="preserve"> —+0,027769, intervalo [0,011976 , 0,045189], que excluye el cero— mientras que el </w:t>
+      </w:r>
+      <w:r>
+        <w:rPr>
+          <w:rFonts w:ascii="Times New Roman" w:cs="Times New Roman" w:eastAsia="Times New Roman" w:hAnsi="Times New Roman"/>
+          <w:b/>
+          <w:bCs/>
+          <w:color w:val="000000"/>
+          <w:sz w:val="24"/>
+          <w:szCs w:val="24"/>
+        </w:rPr>
+        <w:t xml:space="preserve">iTransformer sigue sin superarlo</w:t>
+      </w:r>
+      <w:r>
+        <w:rPr>
+          <w:rFonts w:ascii="Times New Roman" w:cs="Times New Roman" w:eastAsia="Times New Roman" w:hAnsi="Times New Roman"/>
+          <w:color w:val="000000"/>
+          <w:sz w:val="24"/>
+          <w:szCs w:val="24"/>
+        </w:rPr>
+        <w:t xml:space="preserve"> —+0,006386, intervalo [−0,008267 , 0,019878]— </w:t>
+      </w:r>
+      <w:r>
+        <w:rPr>
+          <w:rFonts w:ascii="Times New Roman" w:cs="Times New Roman" w:eastAsia="Times New Roman" w:hAnsi="Times New Roman"/>
+          <w:b/>
+          <w:bCs/>
+          <w:color w:val="000000"/>
+          <w:sz w:val="24"/>
+          <w:szCs w:val="24"/>
+        </w:rPr>
+        <w:t xml:space="preserve">ni con cuatro veces más observaciones</w:t>
+      </w:r>
+      <w:r>
+        <w:rPr>
+          <w:rFonts w:ascii="Times New Roman" w:cs="Times New Roman" w:eastAsia="Times New Roman" w:hAnsi="Times New Roman"/>
+          <w:color w:val="000000"/>
+          <w:sz w:val="24"/>
+          <w:szCs w:val="24"/>
+        </w:rPr>
+        <w:t xml:space="preserve">. Lo que era «ninguno de los dos» resultó ser uno de cada.</w:t>
       </w:r>
     </w:p>
     <w:p>
@@ -14945,7 +15045,7 @@
           <w:sz w:val="24"/>
           <w:szCs w:val="24"/>
         </w:rPr>
-        <w:t xml:space="preserve">7. Sobre el bloque de prueba: los dos modelos fallan en clases opuestas</w:t>
+        <w:t xml:space="preserve">7. Por clase: lo que el bloque de prueba sugirió y lo que la potencia confirmó</w:t>
       </w:r>
     </w:p>
     <w:p>
@@ -14960,7 +15060,47 @@
           <w:sz w:val="24"/>
           <w:szCs w:val="24"/>
         </w:rPr>
-        <w:t xml:space="preserve">Esto no aparece al mirar el F1 macro, y es lo más preciso que se puede decir del resultado final.</w:t>
+        <w:t xml:space="preserve">Aquí hay dos mediciones y </w:t>
+      </w:r>
+      <w:r>
+        <w:rPr>
+          <w:rFonts w:ascii="Times New Roman" w:cs="Times New Roman" w:eastAsia="Times New Roman" w:hAnsi="Times New Roman"/>
+          <w:b/>
+          <w:bCs/>
+          <w:color w:val="000000"/>
+          <w:sz w:val="24"/>
+          <w:szCs w:val="24"/>
+        </w:rPr>
+        <w:t xml:space="preserve">la segunda corrige a la primera</w:t>
+      </w:r>
+      <w:r>
+        <w:rPr>
+          <w:rFonts w:ascii="Times New Roman" w:cs="Times New Roman" w:eastAsia="Times New Roman" w:hAnsi="Times New Roman"/>
+          <w:color w:val="000000"/>
+          <w:sz w:val="24"/>
+          <w:szCs w:val="24"/>
+        </w:rPr>
+        <w:t xml:space="preserve">. Van juntas porque la diferencia entre ellas es el hallazgo, no un detalle de método.</w:t>
+      </w:r>
+    </w:p>
+    <w:p>
+      <w:pPr>
+        <w:pStyle w:val="Heading3"/>
+        <w:keepNext/>
+        <w:spacing w:after="0" w:before="0" w:line="480" w:lineRule="auto"/>
+      </w:pPr>
+      <w:r>
+        <w:rPr>
+          <w:rFonts w:ascii="Times New Roman" w:cs="Times New Roman" w:eastAsia="Times New Roman" w:hAnsi="Times New Roman"/>
+          <w:b/>
+          <w:bCs/>
+          <w:i/>
+          <w:iCs/>
+          <w:color w:val="000000"/>
+          <w:sz w:val="24"/>
+          <w:szCs w:val="24"/>
+        </w:rPr>
+        <w:t xml:space="preserve">Lo que se vio en el bloque de prueba</w:t>
       </w:r>
     </w:p>
     <w:p>
@@ -14977,7 +15117,7 @@
           <w:sz w:val="24"/>
           <w:szCs w:val="24"/>
         </w:rPr>
-        <w:t xml:space="preserve">Tabla.</w:t>
+        <w:t xml:space="preserve">Tabla 7.1.</w:t>
       </w:r>
       <w:r>
         <w:rPr>
@@ -15001,7 +15141,47 @@
           <w:sz w:val="24"/>
           <w:szCs w:val="24"/>
         </w:rPr>
-        <w:t xml:space="preserve">Dos lecturas que conviene no separar:</w:t>
+        <w:t xml:space="preserve">Leído solo, dice que </w:t>
+      </w:r>
+      <w:r>
+        <w:rPr>
+          <w:rFonts w:ascii="Times New Roman" w:cs="Times New Roman" w:eastAsia="Times New Roman" w:hAnsi="Times New Roman"/>
+          <w:b/>
+          <w:bCs/>
+          <w:color w:val="000000"/>
+          <w:sz w:val="24"/>
+          <w:szCs w:val="24"/>
+        </w:rPr>
+        <w:t xml:space="preserve">ningún modelo supera al azar en las dos clases</w:t>
+      </w:r>
+      <w:r>
+        <w:rPr>
+          <w:rFonts w:ascii="Times New Roman" w:cs="Times New Roman" w:eastAsia="Times New Roman" w:hAnsi="Times New Roman"/>
+          <w:color w:val="000000"/>
+          <w:sz w:val="24"/>
+          <w:szCs w:val="24"/>
+        </w:rPr>
+        <w:t xml:space="preserve"> y que el bosque queda por debajo del azar en Máximo. Con 86 ejemplos por clase, esa lectura era la más severa posible del resultado.</w:t>
+      </w:r>
+    </w:p>
+    <w:p>
+      <w:pPr>
+        <w:pStyle w:val="Heading3"/>
+        <w:keepNext/>
+        <w:spacing w:after="0" w:before="0" w:line="480" w:lineRule="auto"/>
+      </w:pPr>
+      <w:r>
+        <w:rPr>
+          <w:rFonts w:ascii="Times New Roman" w:cs="Times New Roman" w:eastAsia="Times New Roman" w:hAnsi="Times New Roman"/>
+          <w:b/>
+          <w:bCs/>
+          <w:i/>
+          <w:iCs/>
+          <w:color w:val="000000"/>
+          <w:sz w:val="24"/>
+          <w:szCs w:val="24"/>
+        </w:rPr>
+        <w:t xml:space="preserve">Lo que dice la agregación de los nueve tramos</w:t>
       </w:r>
     </w:p>
     <w:p>
@@ -15012,62 +15192,31 @@
       <w:r>
         <w:rPr>
           <w:rFonts w:ascii="Times New Roman" w:cs="Times New Roman" w:eastAsia="Times New Roman" w:hAnsi="Times New Roman"/>
-          <w:b/>
-          <w:bCs/>
-          <w:color w:val="000000"/>
-          <w:sz w:val="24"/>
-          <w:szCs w:val="24"/>
-        </w:rPr>
-        <w:t xml:space="preserve">Ningún modelo supera al azar en las dos clases extremas.</w:t>
-      </w:r>
-      <w:r>
-        <w:rPr>
-          <w:rFonts w:ascii="Times New Roman" w:cs="Times New Roman" w:eastAsia="Times New Roman" w:hAnsi="Times New Roman"/>
-          <w:color w:val="000000"/>
-          <w:sz w:val="24"/>
-          <w:szCs w:val="24"/>
-        </w:rPr>
-        <w:t xml:space="preserve"> El bosque le gana holgadamente en Mínimo y queda </w:t>
-      </w:r>
-      <w:r>
-        <w:rPr>
-          <w:rFonts w:ascii="Times New Roman" w:cs="Times New Roman" w:eastAsia="Times New Roman" w:hAnsi="Times New Roman"/>
-          <w:b/>
-          <w:bCs/>
-          <w:color w:val="000000"/>
-          <w:sz w:val="24"/>
-          <w:szCs w:val="24"/>
-        </w:rPr>
-        <w:t xml:space="preserve">por debajo del azar</w:t>
-      </w:r>
-      <w:r>
-        <w:rPr>
-          <w:rFonts w:ascii="Times New Roman" w:cs="Times New Roman" w:eastAsia="Times New Roman" w:hAnsi="Times New Roman"/>
-          <w:color w:val="000000"/>
-          <w:sz w:val="24"/>
-          <w:szCs w:val="24"/>
-        </w:rPr>
-        <w:t xml:space="preserve"> en Máximo; el fundacional queda por debajo en Máximo; y el avanzado queda por debajo en Mínimo. Es la forma más exacta del resultado negativo, y más severa que mirar solo el F1 macro: no es que el sistema detecte poco, es que </w:t>
-      </w:r>
-      <w:r>
-        <w:rPr>
-          <w:rFonts w:ascii="Times New Roman" w:cs="Times New Roman" w:eastAsia="Times New Roman" w:hAnsi="Times New Roman"/>
-          <w:b/>
-          <w:bCs/>
-          <w:color w:val="000000"/>
-          <w:sz w:val="24"/>
-          <w:szCs w:val="24"/>
-        </w:rPr>
-        <w:t xml:space="preserve">ningún modelo detecta las dos cosas que hay que detectar</w:t>
-      </w:r>
-      <w:r>
-        <w:rPr>
-          <w:rFonts w:ascii="Times New Roman" w:cs="Times New Roman" w:eastAsia="Times New Roman" w:hAnsi="Times New Roman"/>
-          <w:color w:val="000000"/>
-          <w:sz w:val="24"/>
-          <w:szCs w:val="24"/>
-        </w:rPr>
-        <w:t xml:space="preserve">.</w:t>
+          <w:color w:val="000000"/>
+          <w:sz w:val="24"/>
+          <w:szCs w:val="24"/>
+        </w:rPr>
+        <w:t xml:space="preserve">Sobre </w:t>
+      </w:r>
+      <w:r>
+        <w:rPr>
+          <w:rFonts w:ascii="Times New Roman" w:cs="Times New Roman" w:eastAsia="Times New Roman" w:hAnsi="Times New Roman"/>
+          <w:b/>
+          <w:bCs/>
+          <w:color w:val="000000"/>
+          <w:sz w:val="24"/>
+          <w:szCs w:val="24"/>
+        </w:rPr>
+        <w:t xml:space="preserve">7 311 filas</w:t>
+      </w:r>
+      <w:r>
+        <w:rPr>
+          <w:rFonts w:ascii="Times New Roman" w:cs="Times New Roman" w:eastAsia="Times New Roman" w:hAnsi="Times New Roman"/>
+          <w:color w:val="000000"/>
+          <w:sz w:val="24"/>
+          <w:szCs w:val="24"/>
+        </w:rPr>
+        <w:t xml:space="preserve">, con intervalo pareado en cada celda:</w:t>
       </w:r>
     </w:p>
     <w:p>
@@ -15084,16 +15233,16 @@
           <w:sz w:val="24"/>
           <w:szCs w:val="24"/>
         </w:rPr>
-        <w:t xml:space="preserve">Y el único que supera al azar en Máximo es el avanzado</w:t>
-      </w:r>
-      <w:r>
-        <w:rPr>
-          <w:rFonts w:ascii="Times New Roman" w:cs="Times New Roman" w:eastAsia="Times New Roman" w:hAnsi="Times New Roman"/>
-          <w:color w:val="000000"/>
-          <w:sz w:val="24"/>
-          <w:szCs w:val="24"/>
-        </w:rPr>
-        <w:t xml:space="preserve">, que es el que pierde en F1 macro. La clase donde el mejor modelo falla es justamente donde el modelo que el enunciado pedía no falla. Decirlo importa en las dos direcciones: es un punto a favor del profundo que el F1 macro esconde, y es la razón por la que promediar las dos clases en una sola métrica puede hacer parecer que un modelo detecta cuando lo que hace es compensar.</w:t>
+        <w:t xml:space="preserve">Tabla 7.2.</w:t>
+      </w:r>
+      <w:r>
+        <w:rPr>
+          <w:rFonts w:ascii="Times New Roman" w:cs="Times New Roman" w:eastAsia="Times New Roman" w:hAnsi="Times New Roman"/>
+          <w:color w:val="000000"/>
+          <w:sz w:val="24"/>
+          <w:szCs w:val="24"/>
+        </w:rPr>
+        <w:t xml:space="preserve"> Diferencia contra el azar por clase, y si el intervalo excluye el cero.</w:t>
       </w:r>
     </w:p>
     <w:p>
@@ -15104,11 +15253,42 @@
       <w:r>
         <w:rPr>
           <w:rFonts w:ascii="Times New Roman" w:cs="Times New Roman" w:eastAsia="Times New Roman" w:hAnsi="Times New Roman"/>
-          <w:color w:val="000000"/>
-          <w:sz w:val="24"/>
-          <w:szCs w:val="24"/>
-        </w:rPr>
-        <w:t xml:space="preserve">No se saca de aquí ninguna configuración nueva ni se propone combinarlos: la sección 7 del protocolo lo prohíbe y esto se reporta como lo que es, una lectura de la única corrida.</w:t>
+          <w:b/>
+          <w:bCs/>
+          <w:color w:val="000000"/>
+          <w:sz w:val="24"/>
+          <w:szCs w:val="24"/>
+        </w:rPr>
+        <w:t xml:space="preserve">El bosque sí supera al azar en las dos clases.</w:t>
+      </w:r>
+      <w:r>
+        <w:rPr>
+          <w:rFonts w:ascii="Times New Roman" w:cs="Times New Roman" w:eastAsia="Times New Roman" w:hAnsi="Times New Roman"/>
+          <w:color w:val="000000"/>
+          <w:sz w:val="24"/>
+          <w:szCs w:val="24"/>
+        </w:rPr>
+        <w:t xml:space="preserve"> Lo que parecía el resultado más severo del informe —que ninguno detectara las dos— era un </w:t>
+      </w:r>
+      <w:r>
+        <w:rPr>
+          <w:rFonts w:ascii="Times New Roman" w:cs="Times New Roman" w:eastAsia="Times New Roman" w:hAnsi="Times New Roman"/>
+          <w:b/>
+          <w:bCs/>
+          <w:color w:val="000000"/>
+          <w:sz w:val="24"/>
+          <w:szCs w:val="24"/>
+        </w:rPr>
+        <w:t xml:space="preserve">artefacto de tener 86 ejemplos por clase</w:t>
+      </w:r>
+      <w:r>
+        <w:rPr>
+          <w:rFonts w:ascii="Times New Roman" w:cs="Times New Roman" w:eastAsia="Times New Roman" w:hAnsi="Times New Roman"/>
+          <w:color w:val="000000"/>
+          <w:sz w:val="24"/>
+          <w:szCs w:val="24"/>
+        </w:rPr>
+        <w:t xml:space="preserve">, no un hecho sobre los modelos. Con cuatro veces más observaciones, la clase Máximo del bosque pasa de estar por debajo del azar a superarlo con intervalo que excluye el cero.</w:t>
       </w:r>
     </w:p>
     <w:p>
@@ -15125,36 +15305,71 @@
           <w:sz w:val="24"/>
           <w:szCs w:val="24"/>
         </w:rPr>
-        <w:t xml:space="preserve">Y hay que decir cuánto pesa esa advertencia, porque está medida.</w:t>
-      </w:r>
-      <w:r>
-        <w:rPr>
-          <w:rFonts w:ascii="Times New Roman" w:cs="Times New Roman" w:eastAsia="Times New Roman" w:hAnsi="Times New Roman"/>
-          <w:color w:val="000000"/>
-          <w:sz w:val="24"/>
-          <w:szCs w:val="24"/>
-        </w:rPr>
-        <w:t xml:space="preserve"> El walk-forward de los nueve tramos comprobó, sobre el bosque, que la asimetría entre las dos clases extremas </w:t>
-      </w:r>
-      <w:r>
-        <w:rPr>
-          <w:rFonts w:ascii="Times New Roman" w:cs="Times New Roman" w:eastAsia="Times New Roman" w:hAnsi="Times New Roman"/>
-          <w:b/>
-          <w:bCs/>
-          <w:color w:val="000000"/>
-          <w:sz w:val="24"/>
-          <w:szCs w:val="24"/>
-        </w:rPr>
-        <w:t xml:space="preserve">no es estable</w:t>
-      </w:r>
-      <w:r>
-        <w:rPr>
-          <w:rFonts w:ascii="Times New Roman" w:cs="Times New Roman" w:eastAsia="Times New Roman" w:hAnsi="Times New Roman"/>
-          <w:color w:val="000000"/>
-          <w:sz w:val="24"/>
-          <w:szCs w:val="24"/>
-        </w:rPr>
-        <w:t xml:space="preserve">: el F1 de mínimos supera al de máximos en </w:t>
+        <w:t xml:space="preserve">Lo que sí sobrevive, y ahora con intervalo:</w:t>
+      </w:r>
+      <w:r>
+        <w:rPr>
+          <w:rFonts w:ascii="Times New Roman" w:cs="Times New Roman" w:eastAsia="Times New Roman" w:hAnsi="Times New Roman"/>
+          <w:color w:val="000000"/>
+          <w:sz w:val="24"/>
+          <w:szCs w:val="24"/>
+        </w:rPr>
+        <w:t xml:space="preserve"> los dos modelos profundos detectan </w:t>
+      </w:r>
+      <w:r>
+        <w:rPr>
+          <w:rFonts w:ascii="Times New Roman" w:cs="Times New Roman" w:eastAsia="Times New Roman" w:hAnsi="Times New Roman"/>
+          <w:b/>
+          <w:bCs/>
+          <w:color w:val="000000"/>
+          <w:sz w:val="24"/>
+          <w:szCs w:val="24"/>
+        </w:rPr>
+        <w:t xml:space="preserve">clases opuestas</w:t>
+      </w:r>
+      <w:r>
+        <w:rPr>
+          <w:rFonts w:ascii="Times New Roman" w:cs="Times New Roman" w:eastAsia="Times New Roman" w:hAnsi="Times New Roman"/>
+          <w:color w:val="000000"/>
+          <w:sz w:val="24"/>
+          <w:szCs w:val="24"/>
+        </w:rPr>
+        <w:t xml:space="preserve">. El iTransformer supera al azar en Máximo y no en Mínimo; Chronos-Bolt, al revés. No es la lectura de un bloque: se sostiene con potencia.</w:t>
+      </w:r>
+    </w:p>
+    <w:p>
+      <w:pPr>
+        <w:pStyle w:val="Heading3"/>
+        <w:keepNext/>
+        <w:spacing w:after="0" w:before="0" w:line="480" w:lineRule="auto"/>
+      </w:pPr>
+      <w:r>
+        <w:rPr>
+          <w:rFonts w:ascii="Times New Roman" w:cs="Times New Roman" w:eastAsia="Times New Roman" w:hAnsi="Times New Roman"/>
+          <w:b/>
+          <w:bCs/>
+          <w:i/>
+          <w:iCs/>
+          <w:color w:val="000000"/>
+          <w:sz w:val="24"/>
+          <w:szCs w:val="24"/>
+        </w:rPr>
+        <w:t xml:space="preserve">Por qué esto importa más allá de la tabla</w:t>
+      </w:r>
+    </w:p>
+    <w:p>
+      <w:pPr>
+        <w:spacing w:after="0" w:line="480" w:lineRule="auto"/>
+        <w:ind w:firstLine="720"/>
+      </w:pPr>
+      <w:r>
+        <w:rPr>
+          <w:rFonts w:ascii="Times New Roman" w:cs="Times New Roman" w:eastAsia="Times New Roman" w:hAnsi="Times New Roman"/>
+          <w:color w:val="000000"/>
+          <w:sz w:val="24"/>
+          <w:szCs w:val="24"/>
+        </w:rPr>
+        <w:t xml:space="preserve">Es la segunda vez en este informe que una lectura por clase sobre un solo bloque no aguanta al volver a medirla —la primera fue la asimetría picos/valles, </w:t>
       </w:r>
       <w:r>
         <w:rPr>
@@ -15174,7 +15389,7 @@
           <w:sz w:val="24"/>
           <w:szCs w:val="24"/>
         </w:rPr>
-        <w:t xml:space="preserve"> tramos, que es lo que daría una moneda. En </w:t>
+        <w:t xml:space="preserve"> tramos— y las dos veces el tamaño de la clase rara fue la causa. En </w:t>
       </w:r>
       <w:r>
         <w:rPr>
@@ -15194,7 +15409,7 @@
           <w:sz w:val="24"/>
           <w:szCs w:val="24"/>
         </w:rPr>
-        <w:t xml:space="preserve"> de los nueve, una de las dos clases dio </w:t>
+        <w:t xml:space="preserve"> de los nueve tramos una de las dos clases dio </w:t>
       </w:r>
       <w:r>
         <w:rPr>
@@ -15214,7 +15429,7 @@
           <w:sz w:val="24"/>
           <w:szCs w:val="24"/>
         </w:rPr>
-        <w:t xml:space="preserve"> exacto — con menos de cien ejemplos por clase, la métrica por clase puede colapsar entera.</w:t>
+        <w:t xml:space="preserve"> exacto: con menos de cien ejemplos, la métrica por clase puede colapsar entera.</w:t>
       </w:r>
     </w:p>
     <w:p>
@@ -15225,51 +15440,37 @@
       <w:r>
         <w:rPr>
           <w:rFonts w:ascii="Times New Roman" w:cs="Times New Roman" w:eastAsia="Times New Roman" w:hAnsi="Times New Roman"/>
-          <w:color w:val="000000"/>
-          <w:sz w:val="24"/>
-          <w:szCs w:val="24"/>
-        </w:rPr>
-        <w:t xml:space="preserve">Los modelos profundos </w:t>
-      </w:r>
-      <w:r>
-        <w:rPr>
-          <w:rFonts w:ascii="Times New Roman" w:cs="Times New Roman" w:eastAsia="Times New Roman" w:hAnsi="Times New Roman"/>
-          <w:b/>
-          <w:bCs/>
-          <w:color w:val="000000"/>
-          <w:sz w:val="24"/>
-          <w:szCs w:val="24"/>
-        </w:rPr>
-        <w:t xml:space="preserve">no se midieron por clase en los nueve tramos</w:t>
-      </w:r>
-      <w:r>
-        <w:rPr>
-          <w:rFonts w:ascii="Times New Roman" w:cs="Times New Roman" w:eastAsia="Times New Roman" w:hAnsi="Times New Roman"/>
-          <w:color w:val="000000"/>
-          <w:sz w:val="24"/>
-          <w:szCs w:val="24"/>
-        </w:rPr>
-        <w:t xml:space="preserve">, así que no hay forma de saber si el patrón de esta tabla se repetiría. Lo que dice esta sección es qué pasó </w:t>
-      </w:r>
-      <w:r>
-        <w:rPr>
-          <w:rFonts w:ascii="Times New Roman" w:cs="Times New Roman" w:eastAsia="Times New Roman" w:hAnsi="Times New Roman"/>
-          <w:b/>
-          <w:bCs/>
-          <w:color w:val="000000"/>
-          <w:sz w:val="24"/>
-          <w:szCs w:val="24"/>
-        </w:rPr>
-        <w:t xml:space="preserve">en el bloque de prueba</w:t>
-      </w:r>
-      <w:r>
-        <w:rPr>
-          <w:rFonts w:ascii="Times New Roman" w:cs="Times New Roman" w:eastAsia="Times New Roman" w:hAnsi="Times New Roman"/>
-          <w:color w:val="000000"/>
-          <w:sz w:val="24"/>
-          <w:szCs w:val="24"/>
-        </w:rPr>
-        <w:t xml:space="preserve">, que es la única estimación limpia que tenemos y también un solo bloque. Leerlo como una propiedad de los modelos —«el avanzado detecta máximos y el bosque mínimos»— sería exactamente el salto que la corrección de la sección de conclusiones tuvo que deshacer: de una diferencia medida a una explicación que suena bien.</w:t>
+          <w:b/>
+          <w:bCs/>
+          <w:color w:val="000000"/>
+          <w:sz w:val="24"/>
+          <w:szCs w:val="24"/>
+        </w:rPr>
+        <w:t xml:space="preserve">La lección es del método y es reutilizable:</w:t>
+      </w:r>
+      <w:r>
+        <w:rPr>
+          <w:rFonts w:ascii="Times New Roman" w:cs="Times New Roman" w:eastAsia="Times New Roman" w:hAnsi="Times New Roman"/>
+          <w:color w:val="000000"/>
+          <w:sz w:val="24"/>
+          <w:szCs w:val="24"/>
+        </w:rPr>
+        <w:t xml:space="preserve"> una métrica por clase sobre 86 ejemplos no distingue un modelo que no detecta de uno que no tuvo con qué demostrarlo. Y como la regla de decisión del proyecto miraba el F1 macro, no habría atrapado ninguna de las dos cosas — ni el falso negativo por clase, ni que un modelo compense una clase con la otra.</w:t>
+      </w:r>
+    </w:p>
+    <w:p>
+      <w:pPr>
+        <w:spacing w:after="0" w:line="480" w:lineRule="auto"/>
+        <w:ind w:firstLine="720"/>
+      </w:pPr>
+      <w:r>
+        <w:rPr>
+          <w:rFonts w:ascii="Times New Roman" w:cs="Times New Roman" w:eastAsia="Times New Roman" w:hAnsi="Times New Roman"/>
+          <w:color w:val="000000"/>
+          <w:sz w:val="24"/>
+          <w:szCs w:val="24"/>
+        </w:rPr>
+        <w:t xml:space="preserve">No se saca de aquí ninguna configuración nueva ni se propone combinar modelos: la sección 7 del protocolo lo prohíbe, y la cifra oficial sigue siendo la del bloque de prueba.</w:t>
       </w:r>
     </w:p>
     <w:p>
@@ -15410,27 +15611,47 @@
           <w:sz w:val="24"/>
           <w:szCs w:val="24"/>
         </w:rPr>
-        <w:t xml:space="preserve">Dicho sin adornos: sobre validación </w:t>
-      </w:r>
-      <w:r>
-        <w:rPr>
-          <w:rFonts w:ascii="Times New Roman" w:cs="Times New Roman" w:eastAsia="Times New Roman" w:hAnsi="Times New Roman"/>
-          <w:b/>
-          <w:bCs/>
-          <w:color w:val="000000"/>
-          <w:sz w:val="24"/>
-          <w:szCs w:val="24"/>
-        </w:rPr>
-        <w:t xml:space="preserve">ninguno de los dos modelos de M3 supera al azar de forma distinguible</w:t>
-      </w:r>
-      <w:r>
-        <w:rPr>
-          <w:rFonts w:ascii="Times New Roman" w:cs="Times New Roman" w:eastAsia="Times New Roman" w:hAnsi="Times New Roman"/>
-          <w:color w:val="000000"/>
-          <w:sz w:val="24"/>
-          <w:szCs w:val="24"/>
-        </w:rPr>
-        <w:t xml:space="preserve">, y el avanzado queda por debajo del bosque clásico en las cinco semillas.</w:t>
+        <w:t xml:space="preserve">Dicho sin adornos: </w:t>
+      </w:r>
+      <w:r>
+        <w:rPr>
+          <w:rFonts w:ascii="Times New Roman" w:cs="Times New Roman" w:eastAsia="Times New Roman" w:hAnsi="Times New Roman"/>
+          <w:b/>
+          <w:bCs/>
+          <w:color w:val="000000"/>
+          <w:sz w:val="24"/>
+          <w:szCs w:val="24"/>
+        </w:rPr>
+        <w:t xml:space="preserve">sobre validación</w:t>
+      </w:r>
+      <w:r>
+        <w:rPr>
+          <w:rFonts w:ascii="Times New Roman" w:cs="Times New Roman" w:eastAsia="Times New Roman" w:hAnsi="Times New Roman"/>
+          <w:color w:val="000000"/>
+          <w:sz w:val="24"/>
+          <w:szCs w:val="24"/>
+        </w:rPr>
+        <w:t xml:space="preserve"> ninguno de los dos modelos de M3 supera al azar de forma distinguible, y el avanzado queda por debajo del bosque clásico en las cinco semillas. Con la potencia de los nueve tramos esa primera mitad se parte —Chronos-Bolt sí lo supera, el iTransformer no— y la segunda se refuerza: por debajo del bosque en </w:t>
+      </w:r>
+      <w:r>
+        <w:rPr>
+          <w:rFonts w:ascii="Times New Roman" w:cs="Times New Roman" w:eastAsia="Times New Roman" w:hAnsi="Times New Roman"/>
+          <w:b/>
+          <w:bCs/>
+          <w:color w:val="000000"/>
+          <w:sz w:val="24"/>
+          <w:szCs w:val="24"/>
+        </w:rPr>
+        <w:t xml:space="preserve">9 de 9</w:t>
+      </w:r>
+      <w:r>
+        <w:rPr>
+          <w:rFonts w:ascii="Times New Roman" w:cs="Times New Roman" w:eastAsia="Times New Roman" w:hAnsi="Times New Roman"/>
+          <w:color w:val="000000"/>
+          <w:sz w:val="24"/>
+          <w:szCs w:val="24"/>
+        </w:rPr>
+        <w:t xml:space="preserve"> tramos.</w:t>
       </w:r>
     </w:p>
     <w:p>
@@ -21073,16 +21294,82 @@
           <w:sz w:val="24"/>
           <w:szCs w:val="24"/>
         </w:rPr>
-        <w:t xml:space="preserve">Ninguno de los dos modelos profundos supera al azar de forma distinguible.</w:t>
-      </w:r>
-      <w:r>
-        <w:rPr>
-          <w:rFonts w:ascii="Times New Roman" w:cs="Times New Roman" w:eastAsia="Times New Roman" w:hAnsi="Times New Roman"/>
-          <w:color w:val="000000"/>
-          <w:sz w:val="24"/>
-          <w:szCs w:val="24"/>
-        </w:rPr>
-        <w:t xml:space="preserve"> Le ganan en la media, y el intervalo incluye el cero en los dos casos. Es el resultado central del informe y va sin adornos. 2. </w:t>
+        <w:t xml:space="preserve">Sobre este bloque, ninguno de los dos modelos profundos supera al azar de forma distinguible.</w:t>
+      </w:r>
+      <w:r>
+        <w:rPr>
+          <w:rFonts w:ascii="Times New Roman" w:cs="Times New Roman" w:eastAsia="Times New Roman" w:hAnsi="Times New Roman"/>
+          <w:color w:val="000000"/>
+          <w:sz w:val="24"/>
+          <w:szCs w:val="24"/>
+        </w:rPr>
+        <w:t xml:space="preserve"> Le ganan en la media, y el intervalo incluye el cero en los dos casos.</w:t>
+      </w:r>
+    </w:p>
+    <w:p>
+      <w:pPr>
+        <w:spacing w:after="0" w:line="480" w:lineRule="auto"/>
+        <w:ind w:firstLine="720"/>
+      </w:pPr>
+      <w:r>
+        <w:rPr>
+          <w:rFonts w:ascii="Times New Roman" w:cs="Times New Roman" w:eastAsia="Times New Roman" w:hAnsi="Times New Roman"/>
+          <w:b/>
+          <w:bCs/>
+          <w:color w:val="000000"/>
+          <w:sz w:val="24"/>
+          <w:szCs w:val="24"/>
+        </w:rPr>
+        <w:t xml:space="preserve">Con la potencia de los nueve tramos esta lectura se parte en dos:</w:t>
+      </w:r>
+      <w:r>
+        <w:rPr>
+          <w:rFonts w:ascii="Times New Roman" w:cs="Times New Roman" w:eastAsia="Times New Roman" w:hAnsi="Times New Roman"/>
+          <w:color w:val="000000"/>
+          <w:sz w:val="24"/>
+          <w:szCs w:val="24"/>
+        </w:rPr>
+        <w:t xml:space="preserve"> Chronos-Bolt </w:t>
+      </w:r>
+      <w:r>
+        <w:rPr>
+          <w:rFonts w:ascii="Times New Roman" w:cs="Times New Roman" w:eastAsia="Times New Roman" w:hAnsi="Times New Roman"/>
+          <w:b/>
+          <w:bCs/>
+          <w:color w:val="000000"/>
+          <w:sz w:val="24"/>
+          <w:szCs w:val="24"/>
+        </w:rPr>
+        <w:t xml:space="preserve">sí</w:t>
+      </w:r>
+      <w:r>
+        <w:rPr>
+          <w:rFonts w:ascii="Times New Roman" w:cs="Times New Roman" w:eastAsia="Times New Roman" w:hAnsi="Times New Roman"/>
+          <w:color w:val="000000"/>
+          <w:sz w:val="24"/>
+          <w:szCs w:val="24"/>
+        </w:rPr>
+        <w:t xml:space="preserve"> lo supera —+0,027769, con intervalo que excluye el cero— y el iTransformer </w:t>
+      </w:r>
+      <w:r>
+        <w:rPr>
+          <w:rFonts w:ascii="Times New Roman" w:cs="Times New Roman" w:eastAsia="Times New Roman" w:hAnsi="Times New Roman"/>
+          <w:b/>
+          <w:bCs/>
+          <w:color w:val="000000"/>
+          <w:sz w:val="24"/>
+          <w:szCs w:val="24"/>
+        </w:rPr>
+        <w:t xml:space="preserve">sigue sin superarlo</w:t>
+      </w:r>
+      <w:r>
+        <w:rPr>
+          <w:rFonts w:ascii="Times New Roman" w:cs="Times New Roman" w:eastAsia="Times New Roman" w:hAnsi="Times New Roman"/>
+          <w:color w:val="000000"/>
+          <w:sz w:val="24"/>
+          <w:szCs w:val="24"/>
+        </w:rPr>
+        <w:t xml:space="preserve"> ni con cuatro veces más observaciones. Ver la 5.4 y las conclusiones. 2. </w:t>
       </w:r>
       <w:r>
         <w:rPr>

</xml_diff>

<commit_message>
La 5.3 acotada, con la propuesta que M3 dejo en su PR (#141)
Isaac corrigio su capitulo contra la agregacion (#139) y dejo escrita la frase que
correspondia a mi archivo en vez de tocarlo. Va tal cual, adaptada a la numeracion nueva.

Decia: "Ninguno de los dos modelos profundos supera al azar de forma distinguible", sin
acotar sobre que. Era cierto sobre validacion y es medio falso con potencia suficiente.

Ahora dice sobre QUE bloque, y que la lectura se parte en dos cuando hay muestra: Chronos
si lo supera (+0,027769, intervalo que excluye el cero) y el iTransformer no, ni con
cuatro veces mas observaciones.

Esa segunda mitad es mas fuerte que la original, no mas debil: no superar al azar con
7.311 filas dice bastante mas que no superarlo con 1.960.


Claude-Session: https://claude.ai/code/session_01YBrT6YULjQyRaZRYdhHbQc

Co-authored-by: Claude Opus 5 <noreply@anthropic.com>
</commit_message>
<xml_diff>
--- a/docs/entregas/semana-5/Caso 1 - Semana 5 - Informe final.docx
+++ b/docs/entregas/semana-5/Caso 1 - Semana 5 - Informe final.docx
@@ -13782,7 +13782,27 @@
           <w:sz w:val="24"/>
           <w:szCs w:val="24"/>
         </w:rPr>
-        <w:t xml:space="preserve">• Ninguno de los dos modelos profundos supera al </w:t>
+        <w:t xml:space="preserve">• Sobre </w:t>
+      </w:r>
+      <w:r>
+        <w:rPr>
+          <w:rFonts w:ascii="Times New Roman" w:cs="Times New Roman" w:eastAsia="Times New Roman" w:hAnsi="Times New Roman"/>
+          <w:b/>
+          <w:bCs/>
+          <w:color w:val="000000"/>
+          <w:sz w:val="24"/>
+          <w:szCs w:val="24"/>
+        </w:rPr>
+        <w:t xml:space="preserve">este bloque</w:t>
+      </w:r>
+      <w:r>
+        <w:rPr>
+          <w:rFonts w:ascii="Times New Roman" w:cs="Times New Roman" w:eastAsia="Times New Roman" w:hAnsi="Times New Roman"/>
+          <w:color w:val="000000"/>
+          <w:sz w:val="24"/>
+          <w:szCs w:val="24"/>
+        </w:rPr>
+        <w:t xml:space="preserve">, ninguno de los dos modelos profundos supera al </w:t>
       </w:r>
       <w:r>
         <w:rPr>
@@ -13800,7 +13820,87 @@
           <w:sz w:val="24"/>
           <w:szCs w:val="24"/>
         </w:rPr>
-        <w:t xml:space="preserve"> de forma distinguible. Le ganan en la media y el intervalo incluye el cero.</w:t>
+        <w:t xml:space="preserve"> de forma distinguible: le ganan en la media y el intervalo incluye el cero. </w:t>
+      </w:r>
+      <w:r>
+        <w:rPr>
+          <w:rFonts w:ascii="Times New Roman" w:cs="Times New Roman" w:eastAsia="Times New Roman" w:hAnsi="Times New Roman"/>
+          <w:b/>
+          <w:bCs/>
+          <w:color w:val="000000"/>
+          <w:sz w:val="24"/>
+          <w:szCs w:val="24"/>
+        </w:rPr>
+        <w:t xml:space="preserve">Esa lectura cambió al medir con más potencia</w:t>
+      </w:r>
+      <w:r>
+        <w:rPr>
+          <w:rFonts w:ascii="Times New Roman" w:cs="Times New Roman" w:eastAsia="Times New Roman" w:hAnsi="Times New Roman"/>
+          <w:color w:val="000000"/>
+          <w:sz w:val="24"/>
+          <w:szCs w:val="24"/>
+        </w:rPr>
+        <w:t xml:space="preserve">, y hay que decirlo aquí para que la tabla no se lea sola: sobre las 7 311 filas agregadas de los nueve tramos, </w:t>
+      </w:r>
+      <w:r>
+        <w:rPr>
+          <w:rFonts w:ascii="Times New Roman" w:cs="Times New Roman" w:eastAsia="Times New Roman" w:hAnsi="Times New Roman"/>
+          <w:b/>
+          <w:bCs/>
+          <w:color w:val="000000"/>
+          <w:sz w:val="24"/>
+          <w:szCs w:val="24"/>
+        </w:rPr>
+        <w:t xml:space="preserve">Chronos-Bolt sí supera al azar</w:t>
+      </w:r>
+      <w:r>
+        <w:rPr>
+          <w:rFonts w:ascii="Times New Roman" w:cs="Times New Roman" w:eastAsia="Times New Roman" w:hAnsi="Times New Roman"/>
+          <w:color w:val="000000"/>
+          <w:sz w:val="24"/>
+          <w:szCs w:val="24"/>
+        </w:rPr>
+        <w:t xml:space="preserve"> —+0,027769, intervalo [0,011976 , 0,045189], que excluye el cero— mientras que el </w:t>
+      </w:r>
+      <w:r>
+        <w:rPr>
+          <w:rFonts w:ascii="Times New Roman" w:cs="Times New Roman" w:eastAsia="Times New Roman" w:hAnsi="Times New Roman"/>
+          <w:b/>
+          <w:bCs/>
+          <w:color w:val="000000"/>
+          <w:sz w:val="24"/>
+          <w:szCs w:val="24"/>
+        </w:rPr>
+        <w:t xml:space="preserve">iTransformer sigue sin superarlo</w:t>
+      </w:r>
+      <w:r>
+        <w:rPr>
+          <w:rFonts w:ascii="Times New Roman" w:cs="Times New Roman" w:eastAsia="Times New Roman" w:hAnsi="Times New Roman"/>
+          <w:color w:val="000000"/>
+          <w:sz w:val="24"/>
+          <w:szCs w:val="24"/>
+        </w:rPr>
+        <w:t xml:space="preserve"> —+0,006386, intervalo [−0,008267 , 0,019878]— </w:t>
+      </w:r>
+      <w:r>
+        <w:rPr>
+          <w:rFonts w:ascii="Times New Roman" w:cs="Times New Roman" w:eastAsia="Times New Roman" w:hAnsi="Times New Roman"/>
+          <w:b/>
+          <w:bCs/>
+          <w:color w:val="000000"/>
+          <w:sz w:val="24"/>
+          <w:szCs w:val="24"/>
+        </w:rPr>
+        <w:t xml:space="preserve">ni con cuatro veces más observaciones</w:t>
+      </w:r>
+      <w:r>
+        <w:rPr>
+          <w:rFonts w:ascii="Times New Roman" w:cs="Times New Roman" w:eastAsia="Times New Roman" w:hAnsi="Times New Roman"/>
+          <w:color w:val="000000"/>
+          <w:sz w:val="24"/>
+          <w:szCs w:val="24"/>
+        </w:rPr>
+        <w:t xml:space="preserve">. Lo que era «ninguno de los dos» resultó ser uno de cada.</w:t>
       </w:r>
     </w:p>
     <w:p>
@@ -14945,7 +15045,7 @@
           <w:sz w:val="24"/>
           <w:szCs w:val="24"/>
         </w:rPr>
-        <w:t xml:space="preserve">7. Sobre el bloque de prueba: los dos modelos fallan en clases opuestas</w:t>
+        <w:t xml:space="preserve">7. Por clase: lo que el bloque de prueba sugirió y lo que la potencia confirmó</w:t>
       </w:r>
     </w:p>
     <w:p>
@@ -14960,7 +15060,47 @@
           <w:sz w:val="24"/>
           <w:szCs w:val="24"/>
         </w:rPr>
-        <w:t xml:space="preserve">Esto no aparece al mirar el F1 macro, y es lo más preciso que se puede decir del resultado final.</w:t>
+        <w:t xml:space="preserve">Aquí hay dos mediciones y </w:t>
+      </w:r>
+      <w:r>
+        <w:rPr>
+          <w:rFonts w:ascii="Times New Roman" w:cs="Times New Roman" w:eastAsia="Times New Roman" w:hAnsi="Times New Roman"/>
+          <w:b/>
+          <w:bCs/>
+          <w:color w:val="000000"/>
+          <w:sz w:val="24"/>
+          <w:szCs w:val="24"/>
+        </w:rPr>
+        <w:t xml:space="preserve">la segunda corrige a la primera</w:t>
+      </w:r>
+      <w:r>
+        <w:rPr>
+          <w:rFonts w:ascii="Times New Roman" w:cs="Times New Roman" w:eastAsia="Times New Roman" w:hAnsi="Times New Roman"/>
+          <w:color w:val="000000"/>
+          <w:sz w:val="24"/>
+          <w:szCs w:val="24"/>
+        </w:rPr>
+        <w:t xml:space="preserve">. Van juntas porque la diferencia entre ellas es el hallazgo, no un detalle de método.</w:t>
+      </w:r>
+    </w:p>
+    <w:p>
+      <w:pPr>
+        <w:pStyle w:val="Heading3"/>
+        <w:keepNext/>
+        <w:spacing w:after="0" w:before="0" w:line="480" w:lineRule="auto"/>
+      </w:pPr>
+      <w:r>
+        <w:rPr>
+          <w:rFonts w:ascii="Times New Roman" w:cs="Times New Roman" w:eastAsia="Times New Roman" w:hAnsi="Times New Roman"/>
+          <w:b/>
+          <w:bCs/>
+          <w:i/>
+          <w:iCs/>
+          <w:color w:val="000000"/>
+          <w:sz w:val="24"/>
+          <w:szCs w:val="24"/>
+        </w:rPr>
+        <w:t xml:space="preserve">Lo que se vio en el bloque de prueba</w:t>
       </w:r>
     </w:p>
     <w:p>
@@ -14977,7 +15117,7 @@
           <w:sz w:val="24"/>
           <w:szCs w:val="24"/>
         </w:rPr>
-        <w:t xml:space="preserve">Tabla.</w:t>
+        <w:t xml:space="preserve">Tabla 7.1.</w:t>
       </w:r>
       <w:r>
         <w:rPr>
@@ -15001,7 +15141,47 @@
           <w:sz w:val="24"/>
           <w:szCs w:val="24"/>
         </w:rPr>
-        <w:t xml:space="preserve">Dos lecturas que conviene no separar:</w:t>
+        <w:t xml:space="preserve">Leído solo, dice que </w:t>
+      </w:r>
+      <w:r>
+        <w:rPr>
+          <w:rFonts w:ascii="Times New Roman" w:cs="Times New Roman" w:eastAsia="Times New Roman" w:hAnsi="Times New Roman"/>
+          <w:b/>
+          <w:bCs/>
+          <w:color w:val="000000"/>
+          <w:sz w:val="24"/>
+          <w:szCs w:val="24"/>
+        </w:rPr>
+        <w:t xml:space="preserve">ningún modelo supera al azar en las dos clases</w:t>
+      </w:r>
+      <w:r>
+        <w:rPr>
+          <w:rFonts w:ascii="Times New Roman" w:cs="Times New Roman" w:eastAsia="Times New Roman" w:hAnsi="Times New Roman"/>
+          <w:color w:val="000000"/>
+          <w:sz w:val="24"/>
+          <w:szCs w:val="24"/>
+        </w:rPr>
+        <w:t xml:space="preserve"> y que el bosque queda por debajo del azar en Máximo. Con 86 ejemplos por clase, esa lectura era la más severa posible del resultado.</w:t>
+      </w:r>
+    </w:p>
+    <w:p>
+      <w:pPr>
+        <w:pStyle w:val="Heading3"/>
+        <w:keepNext/>
+        <w:spacing w:after="0" w:before="0" w:line="480" w:lineRule="auto"/>
+      </w:pPr>
+      <w:r>
+        <w:rPr>
+          <w:rFonts w:ascii="Times New Roman" w:cs="Times New Roman" w:eastAsia="Times New Roman" w:hAnsi="Times New Roman"/>
+          <w:b/>
+          <w:bCs/>
+          <w:i/>
+          <w:iCs/>
+          <w:color w:val="000000"/>
+          <w:sz w:val="24"/>
+          <w:szCs w:val="24"/>
+        </w:rPr>
+        <w:t xml:space="preserve">Lo que dice la agregación de los nueve tramos</w:t>
       </w:r>
     </w:p>
     <w:p>
@@ -15012,62 +15192,31 @@
       <w:r>
         <w:rPr>
           <w:rFonts w:ascii="Times New Roman" w:cs="Times New Roman" w:eastAsia="Times New Roman" w:hAnsi="Times New Roman"/>
-          <w:b/>
-          <w:bCs/>
-          <w:color w:val="000000"/>
-          <w:sz w:val="24"/>
-          <w:szCs w:val="24"/>
-        </w:rPr>
-        <w:t xml:space="preserve">Ningún modelo supera al azar en las dos clases extremas.</w:t>
-      </w:r>
-      <w:r>
-        <w:rPr>
-          <w:rFonts w:ascii="Times New Roman" w:cs="Times New Roman" w:eastAsia="Times New Roman" w:hAnsi="Times New Roman"/>
-          <w:color w:val="000000"/>
-          <w:sz w:val="24"/>
-          <w:szCs w:val="24"/>
-        </w:rPr>
-        <w:t xml:space="preserve"> El bosque le gana holgadamente en Mínimo y queda </w:t>
-      </w:r>
-      <w:r>
-        <w:rPr>
-          <w:rFonts w:ascii="Times New Roman" w:cs="Times New Roman" w:eastAsia="Times New Roman" w:hAnsi="Times New Roman"/>
-          <w:b/>
-          <w:bCs/>
-          <w:color w:val="000000"/>
-          <w:sz w:val="24"/>
-          <w:szCs w:val="24"/>
-        </w:rPr>
-        <w:t xml:space="preserve">por debajo del azar</w:t>
-      </w:r>
-      <w:r>
-        <w:rPr>
-          <w:rFonts w:ascii="Times New Roman" w:cs="Times New Roman" w:eastAsia="Times New Roman" w:hAnsi="Times New Roman"/>
-          <w:color w:val="000000"/>
-          <w:sz w:val="24"/>
-          <w:szCs w:val="24"/>
-        </w:rPr>
-        <w:t xml:space="preserve"> en Máximo; el fundacional queda por debajo en Máximo; y el avanzado queda por debajo en Mínimo. Es la forma más exacta del resultado negativo, y más severa que mirar solo el F1 macro: no es que el sistema detecte poco, es que </w:t>
-      </w:r>
-      <w:r>
-        <w:rPr>
-          <w:rFonts w:ascii="Times New Roman" w:cs="Times New Roman" w:eastAsia="Times New Roman" w:hAnsi="Times New Roman"/>
-          <w:b/>
-          <w:bCs/>
-          <w:color w:val="000000"/>
-          <w:sz w:val="24"/>
-          <w:szCs w:val="24"/>
-        </w:rPr>
-        <w:t xml:space="preserve">ningún modelo detecta las dos cosas que hay que detectar</w:t>
-      </w:r>
-      <w:r>
-        <w:rPr>
-          <w:rFonts w:ascii="Times New Roman" w:cs="Times New Roman" w:eastAsia="Times New Roman" w:hAnsi="Times New Roman"/>
-          <w:color w:val="000000"/>
-          <w:sz w:val="24"/>
-          <w:szCs w:val="24"/>
-        </w:rPr>
-        <w:t xml:space="preserve">.</w:t>
+          <w:color w:val="000000"/>
+          <w:sz w:val="24"/>
+          <w:szCs w:val="24"/>
+        </w:rPr>
+        <w:t xml:space="preserve">Sobre </w:t>
+      </w:r>
+      <w:r>
+        <w:rPr>
+          <w:rFonts w:ascii="Times New Roman" w:cs="Times New Roman" w:eastAsia="Times New Roman" w:hAnsi="Times New Roman"/>
+          <w:b/>
+          <w:bCs/>
+          <w:color w:val="000000"/>
+          <w:sz w:val="24"/>
+          <w:szCs w:val="24"/>
+        </w:rPr>
+        <w:t xml:space="preserve">7 311 filas</w:t>
+      </w:r>
+      <w:r>
+        <w:rPr>
+          <w:rFonts w:ascii="Times New Roman" w:cs="Times New Roman" w:eastAsia="Times New Roman" w:hAnsi="Times New Roman"/>
+          <w:color w:val="000000"/>
+          <w:sz w:val="24"/>
+          <w:szCs w:val="24"/>
+        </w:rPr>
+        <w:t xml:space="preserve">, con intervalo pareado en cada celda:</w:t>
       </w:r>
     </w:p>
     <w:p>
@@ -15084,16 +15233,16 @@
           <w:sz w:val="24"/>
           <w:szCs w:val="24"/>
         </w:rPr>
-        <w:t xml:space="preserve">Y el único que supera al azar en Máximo es el avanzado</w:t>
-      </w:r>
-      <w:r>
-        <w:rPr>
-          <w:rFonts w:ascii="Times New Roman" w:cs="Times New Roman" w:eastAsia="Times New Roman" w:hAnsi="Times New Roman"/>
-          <w:color w:val="000000"/>
-          <w:sz w:val="24"/>
-          <w:szCs w:val="24"/>
-        </w:rPr>
-        <w:t xml:space="preserve">, que es el que pierde en F1 macro. La clase donde el mejor modelo falla es justamente donde el modelo que el enunciado pedía no falla. Decirlo importa en las dos direcciones: es un punto a favor del profundo que el F1 macro esconde, y es la razón por la que promediar las dos clases en una sola métrica puede hacer parecer que un modelo detecta cuando lo que hace es compensar.</w:t>
+        <w:t xml:space="preserve">Tabla 7.2.</w:t>
+      </w:r>
+      <w:r>
+        <w:rPr>
+          <w:rFonts w:ascii="Times New Roman" w:cs="Times New Roman" w:eastAsia="Times New Roman" w:hAnsi="Times New Roman"/>
+          <w:color w:val="000000"/>
+          <w:sz w:val="24"/>
+          <w:szCs w:val="24"/>
+        </w:rPr>
+        <w:t xml:space="preserve"> Diferencia contra el azar por clase, y si el intervalo excluye el cero.</w:t>
       </w:r>
     </w:p>
     <w:p>
@@ -15104,11 +15253,42 @@
       <w:r>
         <w:rPr>
           <w:rFonts w:ascii="Times New Roman" w:cs="Times New Roman" w:eastAsia="Times New Roman" w:hAnsi="Times New Roman"/>
-          <w:color w:val="000000"/>
-          <w:sz w:val="24"/>
-          <w:szCs w:val="24"/>
-        </w:rPr>
-        <w:t xml:space="preserve">No se saca de aquí ninguna configuración nueva ni se propone combinarlos: la sección 7 del protocolo lo prohíbe y esto se reporta como lo que es, una lectura de la única corrida.</w:t>
+          <w:b/>
+          <w:bCs/>
+          <w:color w:val="000000"/>
+          <w:sz w:val="24"/>
+          <w:szCs w:val="24"/>
+        </w:rPr>
+        <w:t xml:space="preserve">El bosque sí supera al azar en las dos clases.</w:t>
+      </w:r>
+      <w:r>
+        <w:rPr>
+          <w:rFonts w:ascii="Times New Roman" w:cs="Times New Roman" w:eastAsia="Times New Roman" w:hAnsi="Times New Roman"/>
+          <w:color w:val="000000"/>
+          <w:sz w:val="24"/>
+          <w:szCs w:val="24"/>
+        </w:rPr>
+        <w:t xml:space="preserve"> Lo que parecía el resultado más severo del informe —que ninguno detectara las dos— era un </w:t>
+      </w:r>
+      <w:r>
+        <w:rPr>
+          <w:rFonts w:ascii="Times New Roman" w:cs="Times New Roman" w:eastAsia="Times New Roman" w:hAnsi="Times New Roman"/>
+          <w:b/>
+          <w:bCs/>
+          <w:color w:val="000000"/>
+          <w:sz w:val="24"/>
+          <w:szCs w:val="24"/>
+        </w:rPr>
+        <w:t xml:space="preserve">artefacto de tener 86 ejemplos por clase</w:t>
+      </w:r>
+      <w:r>
+        <w:rPr>
+          <w:rFonts w:ascii="Times New Roman" w:cs="Times New Roman" w:eastAsia="Times New Roman" w:hAnsi="Times New Roman"/>
+          <w:color w:val="000000"/>
+          <w:sz w:val="24"/>
+          <w:szCs w:val="24"/>
+        </w:rPr>
+        <w:t xml:space="preserve">, no un hecho sobre los modelos. Con cuatro veces más observaciones, la clase Máximo del bosque pasa de estar por debajo del azar a superarlo con intervalo que excluye el cero.</w:t>
       </w:r>
     </w:p>
     <w:p>
@@ -15125,36 +15305,71 @@
           <w:sz w:val="24"/>
           <w:szCs w:val="24"/>
         </w:rPr>
-        <w:t xml:space="preserve">Y hay que decir cuánto pesa esa advertencia, porque está medida.</w:t>
-      </w:r>
-      <w:r>
-        <w:rPr>
-          <w:rFonts w:ascii="Times New Roman" w:cs="Times New Roman" w:eastAsia="Times New Roman" w:hAnsi="Times New Roman"/>
-          <w:color w:val="000000"/>
-          <w:sz w:val="24"/>
-          <w:szCs w:val="24"/>
-        </w:rPr>
-        <w:t xml:space="preserve"> El walk-forward de los nueve tramos comprobó, sobre el bosque, que la asimetría entre las dos clases extremas </w:t>
-      </w:r>
-      <w:r>
-        <w:rPr>
-          <w:rFonts w:ascii="Times New Roman" w:cs="Times New Roman" w:eastAsia="Times New Roman" w:hAnsi="Times New Roman"/>
-          <w:b/>
-          <w:bCs/>
-          <w:color w:val="000000"/>
-          <w:sz w:val="24"/>
-          <w:szCs w:val="24"/>
-        </w:rPr>
-        <w:t xml:space="preserve">no es estable</w:t>
-      </w:r>
-      <w:r>
-        <w:rPr>
-          <w:rFonts w:ascii="Times New Roman" w:cs="Times New Roman" w:eastAsia="Times New Roman" w:hAnsi="Times New Roman"/>
-          <w:color w:val="000000"/>
-          <w:sz w:val="24"/>
-          <w:szCs w:val="24"/>
-        </w:rPr>
-        <w:t xml:space="preserve">: el F1 de mínimos supera al de máximos en </w:t>
+        <w:t xml:space="preserve">Lo que sí sobrevive, y ahora con intervalo:</w:t>
+      </w:r>
+      <w:r>
+        <w:rPr>
+          <w:rFonts w:ascii="Times New Roman" w:cs="Times New Roman" w:eastAsia="Times New Roman" w:hAnsi="Times New Roman"/>
+          <w:color w:val="000000"/>
+          <w:sz w:val="24"/>
+          <w:szCs w:val="24"/>
+        </w:rPr>
+        <w:t xml:space="preserve"> los dos modelos profundos detectan </w:t>
+      </w:r>
+      <w:r>
+        <w:rPr>
+          <w:rFonts w:ascii="Times New Roman" w:cs="Times New Roman" w:eastAsia="Times New Roman" w:hAnsi="Times New Roman"/>
+          <w:b/>
+          <w:bCs/>
+          <w:color w:val="000000"/>
+          <w:sz w:val="24"/>
+          <w:szCs w:val="24"/>
+        </w:rPr>
+        <w:t xml:space="preserve">clases opuestas</w:t>
+      </w:r>
+      <w:r>
+        <w:rPr>
+          <w:rFonts w:ascii="Times New Roman" w:cs="Times New Roman" w:eastAsia="Times New Roman" w:hAnsi="Times New Roman"/>
+          <w:color w:val="000000"/>
+          <w:sz w:val="24"/>
+          <w:szCs w:val="24"/>
+        </w:rPr>
+        <w:t xml:space="preserve">. El iTransformer supera al azar en Máximo y no en Mínimo; Chronos-Bolt, al revés. No es la lectura de un bloque: se sostiene con potencia.</w:t>
+      </w:r>
+    </w:p>
+    <w:p>
+      <w:pPr>
+        <w:pStyle w:val="Heading3"/>
+        <w:keepNext/>
+        <w:spacing w:after="0" w:before="0" w:line="480" w:lineRule="auto"/>
+      </w:pPr>
+      <w:r>
+        <w:rPr>
+          <w:rFonts w:ascii="Times New Roman" w:cs="Times New Roman" w:eastAsia="Times New Roman" w:hAnsi="Times New Roman"/>
+          <w:b/>
+          <w:bCs/>
+          <w:i/>
+          <w:iCs/>
+          <w:color w:val="000000"/>
+          <w:sz w:val="24"/>
+          <w:szCs w:val="24"/>
+        </w:rPr>
+        <w:t xml:space="preserve">Por qué esto importa más allá de la tabla</w:t>
+      </w:r>
+    </w:p>
+    <w:p>
+      <w:pPr>
+        <w:spacing w:after="0" w:line="480" w:lineRule="auto"/>
+        <w:ind w:firstLine="720"/>
+      </w:pPr>
+      <w:r>
+        <w:rPr>
+          <w:rFonts w:ascii="Times New Roman" w:cs="Times New Roman" w:eastAsia="Times New Roman" w:hAnsi="Times New Roman"/>
+          <w:color w:val="000000"/>
+          <w:sz w:val="24"/>
+          <w:szCs w:val="24"/>
+        </w:rPr>
+        <w:t xml:space="preserve">Es la segunda vez en este informe que una lectura por clase sobre un solo bloque no aguanta al volver a medirla —la primera fue la asimetría picos/valles, </w:t>
       </w:r>
       <w:r>
         <w:rPr>
@@ -15174,7 +15389,7 @@
           <w:sz w:val="24"/>
           <w:szCs w:val="24"/>
         </w:rPr>
-        <w:t xml:space="preserve"> tramos, que es lo que daría una moneda. En </w:t>
+        <w:t xml:space="preserve"> tramos— y las dos veces el tamaño de la clase rara fue la causa. En </w:t>
       </w:r>
       <w:r>
         <w:rPr>
@@ -15194,7 +15409,7 @@
           <w:sz w:val="24"/>
           <w:szCs w:val="24"/>
         </w:rPr>
-        <w:t xml:space="preserve"> de los nueve, una de las dos clases dio </w:t>
+        <w:t xml:space="preserve"> de los nueve tramos una de las dos clases dio </w:t>
       </w:r>
       <w:r>
         <w:rPr>
@@ -15214,7 +15429,7 @@
           <w:sz w:val="24"/>
           <w:szCs w:val="24"/>
         </w:rPr>
-        <w:t xml:space="preserve"> exacto — con menos de cien ejemplos por clase, la métrica por clase puede colapsar entera.</w:t>
+        <w:t xml:space="preserve"> exacto: con menos de cien ejemplos, la métrica por clase puede colapsar entera.</w:t>
       </w:r>
     </w:p>
     <w:p>
@@ -15225,51 +15440,37 @@
       <w:r>
         <w:rPr>
           <w:rFonts w:ascii="Times New Roman" w:cs="Times New Roman" w:eastAsia="Times New Roman" w:hAnsi="Times New Roman"/>
-          <w:color w:val="000000"/>
-          <w:sz w:val="24"/>
-          <w:szCs w:val="24"/>
-        </w:rPr>
-        <w:t xml:space="preserve">Los modelos profundos </w:t>
-      </w:r>
-      <w:r>
-        <w:rPr>
-          <w:rFonts w:ascii="Times New Roman" w:cs="Times New Roman" w:eastAsia="Times New Roman" w:hAnsi="Times New Roman"/>
-          <w:b/>
-          <w:bCs/>
-          <w:color w:val="000000"/>
-          <w:sz w:val="24"/>
-          <w:szCs w:val="24"/>
-        </w:rPr>
-        <w:t xml:space="preserve">no se midieron por clase en los nueve tramos</w:t>
-      </w:r>
-      <w:r>
-        <w:rPr>
-          <w:rFonts w:ascii="Times New Roman" w:cs="Times New Roman" w:eastAsia="Times New Roman" w:hAnsi="Times New Roman"/>
-          <w:color w:val="000000"/>
-          <w:sz w:val="24"/>
-          <w:szCs w:val="24"/>
-        </w:rPr>
-        <w:t xml:space="preserve">, así que no hay forma de saber si el patrón de esta tabla se repetiría. Lo que dice esta sección es qué pasó </w:t>
-      </w:r>
-      <w:r>
-        <w:rPr>
-          <w:rFonts w:ascii="Times New Roman" w:cs="Times New Roman" w:eastAsia="Times New Roman" w:hAnsi="Times New Roman"/>
-          <w:b/>
-          <w:bCs/>
-          <w:color w:val="000000"/>
-          <w:sz w:val="24"/>
-          <w:szCs w:val="24"/>
-        </w:rPr>
-        <w:t xml:space="preserve">en el bloque de prueba</w:t>
-      </w:r>
-      <w:r>
-        <w:rPr>
-          <w:rFonts w:ascii="Times New Roman" w:cs="Times New Roman" w:eastAsia="Times New Roman" w:hAnsi="Times New Roman"/>
-          <w:color w:val="000000"/>
-          <w:sz w:val="24"/>
-          <w:szCs w:val="24"/>
-        </w:rPr>
-        <w:t xml:space="preserve">, que es la única estimación limpia que tenemos y también un solo bloque. Leerlo como una propiedad de los modelos —«el avanzado detecta máximos y el bosque mínimos»— sería exactamente el salto que la corrección de la sección de conclusiones tuvo que deshacer: de una diferencia medida a una explicación que suena bien.</w:t>
+          <w:b/>
+          <w:bCs/>
+          <w:color w:val="000000"/>
+          <w:sz w:val="24"/>
+          <w:szCs w:val="24"/>
+        </w:rPr>
+        <w:t xml:space="preserve">La lección es del método y es reutilizable:</w:t>
+      </w:r>
+      <w:r>
+        <w:rPr>
+          <w:rFonts w:ascii="Times New Roman" w:cs="Times New Roman" w:eastAsia="Times New Roman" w:hAnsi="Times New Roman"/>
+          <w:color w:val="000000"/>
+          <w:sz w:val="24"/>
+          <w:szCs w:val="24"/>
+        </w:rPr>
+        <w:t xml:space="preserve"> una métrica por clase sobre 86 ejemplos no distingue un modelo que no detecta de uno que no tuvo con qué demostrarlo. Y como la regla de decisión del proyecto miraba el F1 macro, no habría atrapado ninguna de las dos cosas — ni el falso negativo por clase, ni que un modelo compense una clase con la otra.</w:t>
+      </w:r>
+    </w:p>
+    <w:p>
+      <w:pPr>
+        <w:spacing w:after="0" w:line="480" w:lineRule="auto"/>
+        <w:ind w:firstLine="720"/>
+      </w:pPr>
+      <w:r>
+        <w:rPr>
+          <w:rFonts w:ascii="Times New Roman" w:cs="Times New Roman" w:eastAsia="Times New Roman" w:hAnsi="Times New Roman"/>
+          <w:color w:val="000000"/>
+          <w:sz w:val="24"/>
+          <w:szCs w:val="24"/>
+        </w:rPr>
+        <w:t xml:space="preserve">No se saca de aquí ninguna configuración nueva ni se propone combinar modelos: la sección 7 del protocolo lo prohíbe, y la cifra oficial sigue siendo la del bloque de prueba.</w:t>
       </w:r>
     </w:p>
     <w:p>
@@ -15410,27 +15611,47 @@
           <w:sz w:val="24"/>
           <w:szCs w:val="24"/>
         </w:rPr>
-        <w:t xml:space="preserve">Dicho sin adornos: sobre validación </w:t>
-      </w:r>
-      <w:r>
-        <w:rPr>
-          <w:rFonts w:ascii="Times New Roman" w:cs="Times New Roman" w:eastAsia="Times New Roman" w:hAnsi="Times New Roman"/>
-          <w:b/>
-          <w:bCs/>
-          <w:color w:val="000000"/>
-          <w:sz w:val="24"/>
-          <w:szCs w:val="24"/>
-        </w:rPr>
-        <w:t xml:space="preserve">ninguno de los dos modelos de M3 supera al azar de forma distinguible</w:t>
-      </w:r>
-      <w:r>
-        <w:rPr>
-          <w:rFonts w:ascii="Times New Roman" w:cs="Times New Roman" w:eastAsia="Times New Roman" w:hAnsi="Times New Roman"/>
-          <w:color w:val="000000"/>
-          <w:sz w:val="24"/>
-          <w:szCs w:val="24"/>
-        </w:rPr>
-        <w:t xml:space="preserve">, y el avanzado queda por debajo del bosque clásico en las cinco semillas.</w:t>
+        <w:t xml:space="preserve">Dicho sin adornos: </w:t>
+      </w:r>
+      <w:r>
+        <w:rPr>
+          <w:rFonts w:ascii="Times New Roman" w:cs="Times New Roman" w:eastAsia="Times New Roman" w:hAnsi="Times New Roman"/>
+          <w:b/>
+          <w:bCs/>
+          <w:color w:val="000000"/>
+          <w:sz w:val="24"/>
+          <w:szCs w:val="24"/>
+        </w:rPr>
+        <w:t xml:space="preserve">sobre validación</w:t>
+      </w:r>
+      <w:r>
+        <w:rPr>
+          <w:rFonts w:ascii="Times New Roman" w:cs="Times New Roman" w:eastAsia="Times New Roman" w:hAnsi="Times New Roman"/>
+          <w:color w:val="000000"/>
+          <w:sz w:val="24"/>
+          <w:szCs w:val="24"/>
+        </w:rPr>
+        <w:t xml:space="preserve"> ninguno de los dos modelos de M3 supera al azar de forma distinguible, y el avanzado queda por debajo del bosque clásico en las cinco semillas. Con la potencia de los nueve tramos esa primera mitad se parte —Chronos-Bolt sí lo supera, el iTransformer no— y la segunda se refuerza: por debajo del bosque en </w:t>
+      </w:r>
+      <w:r>
+        <w:rPr>
+          <w:rFonts w:ascii="Times New Roman" w:cs="Times New Roman" w:eastAsia="Times New Roman" w:hAnsi="Times New Roman"/>
+          <w:b/>
+          <w:bCs/>
+          <w:color w:val="000000"/>
+          <w:sz w:val="24"/>
+          <w:szCs w:val="24"/>
+        </w:rPr>
+        <w:t xml:space="preserve">9 de 9</w:t>
+      </w:r>
+      <w:r>
+        <w:rPr>
+          <w:rFonts w:ascii="Times New Roman" w:cs="Times New Roman" w:eastAsia="Times New Roman" w:hAnsi="Times New Roman"/>
+          <w:color w:val="000000"/>
+          <w:sz w:val="24"/>
+          <w:szCs w:val="24"/>
+        </w:rPr>
+        <w:t xml:space="preserve"> tramos.</w:t>
       </w:r>
     </w:p>
     <w:p>
@@ -21073,16 +21294,82 @@
           <w:sz w:val="24"/>
           <w:szCs w:val="24"/>
         </w:rPr>
-        <w:t xml:space="preserve">Ninguno de los dos modelos profundos supera al azar de forma distinguible.</w:t>
-      </w:r>
-      <w:r>
-        <w:rPr>
-          <w:rFonts w:ascii="Times New Roman" w:cs="Times New Roman" w:eastAsia="Times New Roman" w:hAnsi="Times New Roman"/>
-          <w:color w:val="000000"/>
-          <w:sz w:val="24"/>
-          <w:szCs w:val="24"/>
-        </w:rPr>
-        <w:t xml:space="preserve"> Le ganan en la media, y el intervalo incluye el cero en los dos casos. Es el resultado central del informe y va sin adornos. 2. </w:t>
+        <w:t xml:space="preserve">Sobre este bloque, ninguno de los dos modelos profundos supera al azar de forma distinguible.</w:t>
+      </w:r>
+      <w:r>
+        <w:rPr>
+          <w:rFonts w:ascii="Times New Roman" w:cs="Times New Roman" w:eastAsia="Times New Roman" w:hAnsi="Times New Roman"/>
+          <w:color w:val="000000"/>
+          <w:sz w:val="24"/>
+          <w:szCs w:val="24"/>
+        </w:rPr>
+        <w:t xml:space="preserve"> Le ganan en la media, y el intervalo incluye el cero en los dos casos.</w:t>
+      </w:r>
+    </w:p>
+    <w:p>
+      <w:pPr>
+        <w:spacing w:after="0" w:line="480" w:lineRule="auto"/>
+        <w:ind w:firstLine="720"/>
+      </w:pPr>
+      <w:r>
+        <w:rPr>
+          <w:rFonts w:ascii="Times New Roman" w:cs="Times New Roman" w:eastAsia="Times New Roman" w:hAnsi="Times New Roman"/>
+          <w:b/>
+          <w:bCs/>
+          <w:color w:val="000000"/>
+          <w:sz w:val="24"/>
+          <w:szCs w:val="24"/>
+        </w:rPr>
+        <w:t xml:space="preserve">Con la potencia de los nueve tramos esta lectura se parte en dos:</w:t>
+      </w:r>
+      <w:r>
+        <w:rPr>
+          <w:rFonts w:ascii="Times New Roman" w:cs="Times New Roman" w:eastAsia="Times New Roman" w:hAnsi="Times New Roman"/>
+          <w:color w:val="000000"/>
+          <w:sz w:val="24"/>
+          <w:szCs w:val="24"/>
+        </w:rPr>
+        <w:t xml:space="preserve"> Chronos-Bolt </w:t>
+      </w:r>
+      <w:r>
+        <w:rPr>
+          <w:rFonts w:ascii="Times New Roman" w:cs="Times New Roman" w:eastAsia="Times New Roman" w:hAnsi="Times New Roman"/>
+          <w:b/>
+          <w:bCs/>
+          <w:color w:val="000000"/>
+          <w:sz w:val="24"/>
+          <w:szCs w:val="24"/>
+        </w:rPr>
+        <w:t xml:space="preserve">sí</w:t>
+      </w:r>
+      <w:r>
+        <w:rPr>
+          <w:rFonts w:ascii="Times New Roman" w:cs="Times New Roman" w:eastAsia="Times New Roman" w:hAnsi="Times New Roman"/>
+          <w:color w:val="000000"/>
+          <w:sz w:val="24"/>
+          <w:szCs w:val="24"/>
+        </w:rPr>
+        <w:t xml:space="preserve"> lo supera —+0,027769, con intervalo que excluye el cero— y el iTransformer </w:t>
+      </w:r>
+      <w:r>
+        <w:rPr>
+          <w:rFonts w:ascii="Times New Roman" w:cs="Times New Roman" w:eastAsia="Times New Roman" w:hAnsi="Times New Roman"/>
+          <w:b/>
+          <w:bCs/>
+          <w:color w:val="000000"/>
+          <w:sz w:val="24"/>
+          <w:szCs w:val="24"/>
+        </w:rPr>
+        <w:t xml:space="preserve">sigue sin superarlo</w:t>
+      </w:r>
+      <w:r>
+        <w:rPr>
+          <w:rFonts w:ascii="Times New Roman" w:cs="Times New Roman" w:eastAsia="Times New Roman" w:hAnsi="Times New Roman"/>
+          <w:color w:val="000000"/>
+          <w:sz w:val="24"/>
+          <w:szCs w:val="24"/>
+        </w:rPr>
+        <w:t xml:space="preserve"> ni con cuatro veces más observaciones. Ver la 5.4 y las conclusiones. 2. </w:t>
       </w:r>
       <w:r>
         <w:rPr>

</xml_diff>